<commit_message>
Rework TCC section 4.7: all h values, fit shown only for the identified h
Section 4.7 of TCC_apenas_exo1_revisado.docx now presents one family of
torque curves for h from 8 mm to the CAD limit (76.846 mm), with the
patent points shown only against the identified h, whose RMSE is the
only one cited; other h values are presented as possible configurations
of the same exoskeleton. Above the traction frontier the cable slackens
at high elevation: the torque goes to zero continuously, with a kink
(slope jump from 1.8 to 17.9 u.p./deg to zero), and stays zero to the end
of the range. New figures tcc_fig3_familia_h.png and
tcc_fig4_indicadores_h.png; Table 10 covers all h, Table 12 removed.

Co-Authored-By: Claude Opus 5.5 <noreply@anthropic.com>
Claude-Session: https://claude.ai/code/session_01TTGvA6kwNXtYCNWyyxgT9v
</commit_message>
<xml_diff>
--- a/tcc/TCC_apenas_exo1_revisado.docx
+++ b/tcc/TCC_apenas_exo1_revisado.docx
@@ -11136,7 +11136,7 @@
         <w:rPr>
           <w:lang w:val="pt-BR"/>
         </w:rPr>
-        <w:t xml:space="preserve"> congelados. Uma família de curvas para sete valores de h e seus nós, ângulos em que as curvas quase coincidem, completam a análise.</w:t>
+        <w:t xml:space="preserve"> congelados. Acima da fronteira, até o limite geométrico do CAD, as mesmas grandezas são calculadas com o cabo frouxo onde a extensão seria negativa, como configurações complementares. Uma família de curvas para todo o intervalo de h e seus nós, ângulos em que as curvas quase coincidem, completam a análise.</w:t>
       </w:r>
     </w:p>
     <w:p>
@@ -22533,20 +22533,33 @@
         <w:rPr>
           <w:lang w:val="pt-BR"/>
         </w:rPr>
-        <w:t xml:space="preserve">A posição da ancoragem h é a grandeza geométrica mais incerta do mecanismo e também a mais fácil de alterar no projeto, por definir apenas onde o cabo é fixado no elo proximal. Esta seção examina como h altera o torque que o mecanismo devolve ao braço e qual h devolve o maior torque com a mesma mola, K = 174,68, e a mesma montagem, X</w:t>
+        <w:t xml:space="preserve">A posição da ancoragem h é a grandeza geométrica mais incerta do mecanismo e também a mais fácil de alterar no projeto, por definir apenas onde o cabo é fixado no elo proximal. O valor identificado, H</w:t>
       </w:r>
       <w:r>
         <w:rPr>
           <w:vertAlign w:val="subscript"/>
           <w:lang w:val="pt-BR"/>
         </w:rPr>
+        <w:t xml:space="preserve">CAL</w:t>
+      </w:r>
+      <w:r>
+        <w:rPr>
+          <w:lang w:val="pt-BR"/>
+        </w:rPr>
+        <w:t xml:space="preserve"> = 22,701 mm, é o único que reproduz a curva da patente, com RMSE de 1,830 u.p. (seção 4.5). Os demais valores examinados nesta seção não são ajustes à curva publicada, e sim configurações possíveis do mesmo exoesqueleto, com a mesma mola, K = 174,68, e a mesma montagem, X</w:t>
+      </w:r>
+      <w:r>
+        <w:rPr>
+          <w:vertAlign w:val="subscript"/>
+          <w:lang w:val="pt-BR"/>
+        </w:rPr>
         <w:t xml:space="preserve">pose</w:t>
       </w:r>
       <w:r>
         <w:rPr>
           <w:lang w:val="pt-BR"/>
         </w:rPr>
-        <w:t xml:space="preserve"> = 37,383 mm.</w:t>
+        <w:t xml:space="preserve"> = 37,383 mm, obtidas apenas pelo deslocamento da ancoragem. Para elas, interessa o torque que o mecanismo devolve, e não a aderência aos pontos extraídos.</w:t>
       </w:r>
     </w:p>
     <w:p>
@@ -22559,7 +22572,7 @@
         <w:rPr>
           <w:lang w:val="pt-BR"/>
         </w:rPr>
-        <w:t xml:space="preserve">O espaço de busca vai de 8 mm até o limite geométrico do CAD, h</w:t>
+        <w:t xml:space="preserve">O espaço examinado vai de 8 mm até o limite geométrico do CAD, h</w:t>
       </w:r>
       <w:r>
         <w:rPr>
@@ -22572,7 +22585,7 @@
         <w:rPr>
           <w:lang w:val="pt-BR"/>
         </w:rPr>
-        <w:t xml:space="preserve"> = 76,846 mm (Tabela 2), e é restringido pela física. Os critérios de fechamento e de trabalho virtual são atendidos em todos os 13.773 valores varridos, com resíduo de trabalho virtual de no máximo 8,0 × 10</w:t>
+        <w:t xml:space="preserve"> = 76,846 mm (Tabela 2). Os critérios de fechamento e de trabalho virtual são atendidos em todos os 13.773 valores varridos, com resíduo de trabalho virtual de no máximo 8,0 × 10</w:t>
       </w:r>
       <w:r>
         <w:rPr>
@@ -22585,7 +22598,7 @@
         <w:rPr>
           <w:lang w:val="pt-BR"/>
         </w:rPr>
-        <w:t xml:space="preserve"> mm/rad; o critério decisivo é a tração. Com X</w:t>
+        <w:t xml:space="preserve"> mm/rad. O critério que divide o espaço é a tração. Com X</w:t>
       </w:r>
       <w:r>
         <w:rPr>
@@ -22598,7 +22611,7 @@
         <w:rPr>
           <w:lang w:val="pt-BR"/>
         </w:rPr>
-        <w:t xml:space="preserve"> congelada, o aumento de h aumenta o curso do cabo — de 28,942 mm em h = 15 mm para 42,435 mm em h = 22,701 mm e 134,626 mm em h = 76,846 mm — e rebaixa a extensão mínima da mola, que ocorre sempre em θ* = 42,917°, com o braço elevado a 180,1°. Essa extensão se anula em h = 32,886 mm; acima desse valor, o cabo afrouxaria no início da faixa. O valor lido no CAD, 34,785 mm, está fora do intervalo viável, com extensão mínima de −2,257 mm.</w:t>
+        <w:t xml:space="preserve"> congelada, o aumento de h aumenta o curso do cabo — de 28,942 mm em h = 15 mm para 42,435 mm em h = 22,701 mm e 134,626 mm em h = 76,846 mm — e rebaixa a extensão mínima da mola, que ocorre sempre em θ* = 42,917°. Essa extensão se anula em h = 32,886 mm, a fronteira de tração. Abaixo dela, o cabo permanece tracionado em toda a faixa; acima, ele afrouxa no início da faixa, com o braço elevado. O valor lido no CAD, 34,785 mm, fica acima da fronteira, com extensão mínima de −2,257 mm.</w:t>
       </w:r>
     </w:p>
     <w:p>
@@ -22611,20 +22624,7 @@
         <w:rPr>
           <w:lang w:val="pt-BR"/>
         </w:rPr>
-        <w:t xml:space="preserve">O limite geométrico do CAD não é, portanto, o que restringe a busca: com a mola e a montagem atuais, o limite ativo é a tração, h ≤ 32,886 mm. O comportamento do mecanismo entre esse valor e os 76,846 mm admitidos pela geometria é discutido ao final desta seção.</w:t>
-      </w:r>
-    </w:p>
-    <w:p>
-      <w:pPr>
-        <w:rPr>
-          <w:lang w:val="pt-BR"/>
-        </w:rPr>
-      </w:pPr>
-      <w:r>
-        <w:rPr>
-          <w:lang w:val="pt-BR"/>
-        </w:rPr>
-        <w:t xml:space="preserve">A Figura 3 mostra a família de curvas de torque para sete valores de h dentro desse intervalo.</w:t>
+        <w:t xml:space="preserve">A Figura 3 mostra a família de curvas de torque em todo o intervalo, de 8 a 76,846 mm. Apenas a curva de h = 22,701 mm é confrontada com os pontos extraídos da patente, porque só ela resulta da identificação.</w:t>
       </w:r>
     </w:p>
     <w:p>
@@ -22640,7 +22640,7 @@
           <w:b/>
           <w:lang w:val="pt-BR"/>
         </w:rPr>
-        <w:t xml:space="preserve">Figura 3 — Família de curvas de torque do cabo para h de 16 a 32,886 mm, com K = 174,68 e X</w:t>
+        <w:t xml:space="preserve">Figura 3 — Família de curvas de torque do cabo para h de 8 a 76,846 mm, com K = 174,68 e X</w:t>
       </w:r>
       <w:r>
         <w:rPr>
@@ -22648,17 +22648,17 @@
           <w:vertAlign w:val="subscript"/>
           <w:lang w:val="pt-BR"/>
         </w:rPr>
-        <w:t>pose</w:t>
+        <w:t xml:space="preserve">pose</w:t>
       </w:r>
       <w:r>
         <w:rPr>
           <w:b/>
           <w:lang w:val="pt-BR"/>
         </w:rPr>
-        <w:t xml:space="preserve"> = 37,383 mm congelados, e os 29 pontos extraídos da patente</w:t>
+        <w:t xml:space="preserve"> = 37,383 mm congelados; a curva de h = 22,701 mm é apresentada com os 29 pontos extraídos da patente</w:t>
       </w:r>
     </w:p>
-    <w:p>
+    <w:p xmlns:a="http://schemas.openxmlformats.org/drawingml/2006/main" xmlns:pic="http://schemas.openxmlformats.org/drawingml/2006/picture">
       <w:pPr>
         <w:keepNext/>
         <w:spacing w:after="60"/>
@@ -22673,22 +22673,22 @@
           <w:lang w:val="pt-BR"/>
         </w:rPr>
         <w:drawing>
-          <wp:inline distT="0" distB="0" distL="0" distR="0" wp14:anchorId="74C59B70" wp14:editId="5BE8FEA3">
-            <wp:extent cx="5943600" cy="3169920"/>
+          <wp:inline distT="0" distB="0" distL="0" distR="0">
+            <wp:extent cx="5943600" cy="3095625"/>
             <wp:effectExtent l="0" t="0" r="0" b="0"/>
-            <wp:docPr id="903" name="Figura 3" descr="Sete curvas de torque do cabo em função de θ* para valores de h entre 16 e 32,886 mm, com a curva de h = 22,701 mm destacada, os pontos extraídos e dois nós marcados."/>
+            <wp:docPr id="903" name="Figura 3" descr="Curvas de torque do cabo em função de θ* para h entre 8 e 76,846 mm, coloridas por h, com a curva do h identificado destacada sobre os pontos extraídos e a fronteira de tração tracejada."/>
             <wp:cNvGraphicFramePr>
-              <a:graphicFrameLocks xmlns:a="http://schemas.openxmlformats.org/drawingml/2006/main" noChangeAspect="1"/>
+              <a:graphicFrameLocks noChangeAspect="1"/>
             </wp:cNvGraphicFramePr>
-            <a:graphic xmlns:a="http://schemas.openxmlformats.org/drawingml/2006/main">
+            <a:graphic>
               <a:graphicData uri="http://schemas.openxmlformats.org/drawingml/2006/picture">
-                <pic:pic xmlns:pic="http://schemas.openxmlformats.org/drawingml/2006/picture">
+                <pic:pic>
                   <pic:nvPicPr>
-                    <pic:cNvPr id="903" name="Figura 3" descr="Sete curvas de torque do cabo em função de θ* para valores de h entre 16 e 32,886 mm, com a curva de h = 22,701 mm destacada, os pontos extraídos e dois nós marcados."/>
+                    <pic:cNvPr id="903" name="Figura 3" descr="Curvas de torque do cabo em função de θ* para h entre 8 e 76,846 mm, coloridas por h, com a curva do h identificado destacada sobre os pontos extraídos e a fronteira de tração tracejada."/>
                     <pic:cNvPicPr/>
                   </pic:nvPicPr>
                   <pic:blipFill>
-                    <a:blip r:embed="rId7"/>
+                    <a:blip r:embed="rIdTccFig3"/>
                     <a:stretch>
                       <a:fillRect/>
                     </a:stretch>
@@ -22696,7 +22696,7 @@
                   <pic:spPr>
                     <a:xfrm>
                       <a:off x="0" y="0"/>
-                      <a:ext cx="5943600" cy="3169920"/>
+                      <a:ext cx="5943600" cy="3095625"/>
                     </a:xfrm>
                     <a:prstGeom prst="rect">
                       <a:avLst/>
@@ -22722,20 +22722,23 @@
           <w:szCs w:val="20"/>
           <w:lang w:val="pt-BR"/>
         </w:rPr>
-        <w:t>Fonte: elaborada pelo autor.</w:t>
+        <w:t xml:space="preserve">Fonte: elaborada pelo autor.</w:t>
       </w:r>
     </w:p>
     <w:p>
       <w:pPr>
+        <w:spacing w:after="160"/>
         <w:rPr>
           <w:lang w:val="pt-BR"/>
         </w:rPr>
       </w:pPr>
       <w:r>
         <w:rPr>
-          <w:lang w:val="pt-BR"/>
-        </w:rPr>
-        <w:t xml:space="preserve">O deslocamento da ancoragem atua como um ganho concentrado na faixa central. As curvas quase coincidem em dois nós, com espalhamento de 9,35 u.p. em θ* = 68,03° (elevação de 155,0°) e de 0,18 u.p. em θ* = 185,71° (elevação de 37,3°), e se abrem ao máximo, 106,79 u.p., em θ* = 130,38° (elevação de 92,6°). Aumentar h eleva, portanto, o torque devolvido entre cerca de 37° e 155° de elevação, justamente na faixa de trabalho, e quase não altera o torque com o braço muito baixo ou muito alto.</w:t>
+          <w:sz w:val="20"/>
+          <w:szCs w:val="20"/>
+          <w:lang w:val="pt-BR"/>
+        </w:rPr>
+        <w:t xml:space="preserve">Nota: eixo superior, elevação anatômica correspondente a θ*.</w:t>
       </w:r>
     </w:p>
     <w:p>
@@ -22748,7 +22751,33 @@
         <w:rPr>
           <w:lang w:val="pt-BR"/>
         </w:rPr>
-        <w:t xml:space="preserve">A Figura 4 apresenta o torque devolvido, o trabalho devolvido, a margem de tração e o ponto morto em função de h, e a Tabela 10 detalha valores selecionados.</w:t>
+        <w:t xml:space="preserve">O deslocamento da ancoragem atua como um ganho concentrado na faixa central. As curvas quase coincidem em dois nós, com espalhamento de 9,35 u.p. em θ* = 68,03° e de 0,18 u.p. em θ* = 185,71°, e se abrem ao máximo em torno de θ* = 130°, onde o pico passa de 57,4 u.p., em h = 8 mm, para 516,7 u.p., no limite do CAD. Acima da fronteira de tração, as curvas caem a zero no início da faixa, à esquerda da figura, e permanecem nulas até θ* = 42,917°.</w:t>
+      </w:r>
+    </w:p>
+    <w:p>
+      <w:pPr>
+        <w:rPr>
+          <w:lang w:val="pt-BR"/>
+        </w:rPr>
+      </w:pPr>
+      <w:r>
+        <w:rPr>
+          <w:lang w:val="pt-BR"/>
+        </w:rPr>
+        <w:t xml:space="preserve">Essa queda não é um salto. O torque é proporcional à extensão da mola, τ = −K δ m/1000, e a extensão chega a zero de forma contínua; no ponto em que o cabo afrouxa, o torque calculado é inferior a 0,02 u.p. em todos os valores examinados. O que muda bruscamente é a inclinação da curva: imediatamente antes do afrouxamento, o torque varia 1,8 u.p. por grau de elevação em h = 35 mm e 17,9 u.p. por grau no limite do CAD; imediatamente depois, a variação é nula. Trata-se, portanto, de uma descontinuidade da derivada do torque, uma quina, e não do torque. Verificou-se ainda que, em todos os casos, o trecho frouxo é contíguo e se estende até o fim da faixa: uma vez afrouxado, o cabo não volta a tracionar com o aumento da elevação, porque o caminho do cabo continua a encurtar.</w:t>
+      </w:r>
+    </w:p>
+    <w:p>
+      <w:pPr>
+        <w:rPr>
+          <w:lang w:val="pt-BR"/>
+        </w:rPr>
+      </w:pPr>
+      <w:r>
+        <w:rPr>
+          <w:lang w:val="pt-BR"/>
+        </w:rPr>
+        <w:t xml:space="preserve">A Figura 4 apresenta os indicadores do torque devolvido em função de h, e a Tabela 10 detalha valores selecionados.</w:t>
       </w:r>
     </w:p>
     <w:p>
@@ -22764,7 +22793,7 @@
           <w:b/>
           <w:lang w:val="pt-BR"/>
         </w:rPr>
-        <w:t xml:space="preserve">Figura 4 — Torque devolvido em função de h, com K = 174,68 e X</w:t>
+        <w:t xml:space="preserve">Figura 4 — Indicadores do torque devolvido em função de h, com K = 174,68 e X</w:t>
       </w:r>
       <w:r>
         <w:rPr>
@@ -22779,7 +22808,7 @@
           <w:b/>
           <w:lang w:val="pt-BR"/>
         </w:rPr>
-        <w:t xml:space="preserve"> = 37,383 mm congelados: pico e média de 90° a 150° de elevação, trabalho devolvido na faixa de operação, extensão mínima da mola e elevação do ponto morto</w:t>
+        <w:t xml:space="preserve"> = 37,383 mm congelados: pico e média de 90° a 150° de elevação, elevação do início da folga do cabo, extensão mínima da mola e elevação do ponto morto</w:t>
       </w:r>
     </w:p>
     <w:p xmlns:a="http://schemas.openxmlformats.org/drawingml/2006/main" xmlns:pic="http://schemas.openxmlformats.org/drawingml/2006/picture">
@@ -22800,7 +22829,7 @@
           <wp:inline distT="0" distB="0" distL="0" distR="0">
             <wp:extent cx="5943600" cy="3803904"/>
             <wp:effectExtent l="0" t="0" r="0" b="0"/>
-            <wp:docPr id="904" name="Figura 4" descr="Quatro painéis em função de h, de 8 a 32,886 mm: torque de pico e médio, trabalho devolvido, extensão mínima da mola com as margens de 10, 5 e 2 mm marcadas, e elevação do ponto morto."/>
+            <wp:docPr id="904" name="Figura 4" descr="Quatro painéis em função de h, de 8 a 76,846 mm: torque de pico e médio, elevação em que o cabo afrouxa, extensão mínima da mola e elevação do ponto morto, com a região de cabo frouxo sombreada."/>
             <wp:cNvGraphicFramePr>
               <a:graphicFrameLocks noChangeAspect="1"/>
             </wp:cNvGraphicFramePr>
@@ -22808,7 +22837,7 @@
               <a:graphicData uri="http://schemas.openxmlformats.org/drawingml/2006/picture">
                 <pic:pic>
                   <pic:nvPicPr>
-                    <pic:cNvPr id="904" name="Figura 4" descr="Quatro painéis em função de h, de 8 a 32,886 mm: torque de pico e médio, trabalho devolvido, extensão mínima da mola com as margens de 10, 5 e 2 mm marcadas, e elevação do ponto morto."/>
+                    <pic:cNvPr id="904" name="Figura 4" descr="Quatro painéis em função de h, de 8 a 76,846 mm: torque de pico e médio, elevação em que o cabo afrouxa, extensão mínima da mola e elevação do ponto morto, com a região de cabo frouxo sombreada."/>
                     <pic:cNvPicPr/>
                   </pic:nvPicPr>
                   <pic:blipFill>
@@ -22862,46 +22891,7 @@
           <w:szCs w:val="20"/>
           <w:lang w:val="pt-BR"/>
         </w:rPr>
-        <w:t xml:space="preserve">Nota: linha contínua, h adotado; linha tracejada, fronteira de tração; pontos do painel da extensão, margens de 10, 5 e 2 mm; linha pontilhada do painel do ponto morto, início da zona neutra indicado na patente (30°).</w:t>
-      </w:r>
-    </w:p>
-    <w:p>
-      <w:pPr>
-        <w:rPr>
-          <w:lang w:val="pt-BR"/>
-        </w:rPr>
-      </w:pPr>
-      <w:r>
-        <w:rPr>
-          <w:lang w:val="pt-BR"/>
-        </w:rPr>
-        <w:t xml:space="preserve">Os três indicadores de torque crescem monotonicamente com h em todo o intervalo viável. Com a mesma mola, o pico passa de 57,4 u.p. em h = 8 mm para 211,9 u.p. na fronteira de tração; o torque médio de 90° a 150°, de 50,3 para 163,6 u.p.; e o trabalho devolvido, de 108,8 para 315,9 u.p.·rad. O motivo é geométrico: o braço de momento é limitado por |OA| = √(h</w:t>
-      </w:r>
-      <w:r>
-        <w:rPr>
-          <w:vertAlign w:val="superscript"/>
-          <w:lang w:val="pt-BR"/>
-        </w:rPr>
-        <w:t xml:space="preserve">2</w:t>
-      </w:r>
-      <w:r>
-        <w:rPr>
-          <w:lang w:val="pt-BR"/>
-        </w:rPr>
-        <w:t xml:space="preserve"> + p</w:t>
-      </w:r>
-      <w:r>
-        <w:rPr>
-          <w:vertAlign w:val="superscript"/>
-          <w:lang w:val="pt-BR"/>
-        </w:rPr>
-        <w:t xml:space="preserve">2</w:t>
-      </w:r>
-      <w:r>
-        <w:rPr>
-          <w:lang w:val="pt-BR"/>
-        </w:rPr>
-        <w:t xml:space="preserve">), que cresce com h, e o curso do cabo, e com ele a força da mola, cresce junto. Não há, portanto, ótimo interior: o maior torque devolvido ocorre no limite da restrição de tração.</w:t>
+        <w:t xml:space="preserve">Nota: linha contínua, h identificado; linha tracejada, fronteira de tração; região sombreada, cabo frouxo em parte da faixa.</w:t>
       </w:r>
     </w:p>
     <w:p>
@@ -22944,13 +22934,13 @@
         <w:tblLook w:val="0420" w:firstRow="1" w:lastRow="0" w:firstColumn="0" w:lastColumn="0" w:noHBand="0" w:noVBand="1"/>
       </w:tblPr>
       <w:tblGrid>
-        <w:gridCol w:w="1200"/>
-        <w:gridCol w:w="1250"/>
+        <w:gridCol w:w="1100"/>
+        <w:gridCol w:w="1050"/>
         <w:gridCol w:w="1400"/>
-        <w:gridCol w:w="1450"/>
+        <w:gridCol w:w="1150"/>
+        <w:gridCol w:w="1900"/>
         <w:gridCol w:w="1300"/>
-        <w:gridCol w:w="1400"/>
-        <w:gridCol w:w="1360"/>
+        <w:gridCol w:w="1460"/>
       </w:tblGrid>
       <w:tr>
         <w:trPr>
@@ -22959,7 +22949,7 @@
         </w:trPr>
         <w:tc>
           <w:tcPr>
-            <w:tcW w:w="1200" w:type="dxa"/>
+            <w:tcW w:w="1100" w:type="dxa"/>
             <w:shd w:val="clear" w:color="auto" w:fill="F2F2F2"/>
             <w:vAlign w:val="center"/>
           </w:tcPr>
@@ -22985,7 +22975,7 @@
         </w:tc>
         <w:tc>
           <w:tcPr>
-            <w:tcW w:w="1250" w:type="dxa"/>
+            <w:tcW w:w="1050" w:type="dxa"/>
             <w:shd w:val="clear" w:color="auto" w:fill="F2F2F2"/>
             <w:vAlign w:val="center"/>
           </w:tcPr>
@@ -23037,7 +23027,7 @@
         </w:tc>
         <w:tc>
           <w:tcPr>
-            <w:tcW w:w="1450" w:type="dxa"/>
+            <w:tcW w:w="1150" w:type="dxa"/>
             <w:shd w:val="clear" w:color="auto" w:fill="F2F2F2"/>
             <w:vAlign w:val="center"/>
           </w:tcPr>
@@ -23057,7 +23047,52 @@
                 <w:szCs w:val="20"/>
                 <w:lang w:val="pt-BR"/>
               </w:rPr>
-              <w:t xml:space="preserve">Trabalho (u.p.·rad)</w:t>
+              <w:t xml:space="preserve">δ</w:t>
+            </w:r>
+            <w:r>
+              <w:rPr>
+                <w:b/>
+                <w:sz w:val="20"/>
+                <w:szCs w:val="20"/>
+                <w:vertAlign w:val="subscript"/>
+                <w:lang w:val="pt-BR"/>
+              </w:rPr>
+              <w:t xml:space="preserve">mín</w:t>
+            </w:r>
+            <w:r>
+              <w:rPr>
+                <w:b/>
+                <w:sz w:val="20"/>
+                <w:szCs w:val="20"/>
+                <w:lang w:val="pt-BR"/>
+              </w:rPr>
+              <w:t xml:space="preserve"> (mm)</w:t>
+            </w:r>
+          </w:p>
+        </w:tc>
+        <w:tc>
+          <w:tcPr>
+            <w:tcW w:w="1900" w:type="dxa"/>
+            <w:shd w:val="clear" w:color="auto" w:fill="F2F2F2"/>
+            <w:vAlign w:val="center"/>
+          </w:tcPr>
+          <w:p>
+            <w:pPr>
+              <w:keepNext/>
+              <w:spacing w:before="20" w:after="20" w:line="240" w:lineRule="auto"/>
+              <w:jc w:val="center"/>
+              <w:rPr>
+                <w:lang w:val="pt-BR"/>
+              </w:rPr>
+            </w:pPr>
+            <w:r>
+              <w:rPr>
+                <w:b/>
+                <w:sz w:val="20"/>
+                <w:szCs w:val="20"/>
+                <w:lang w:val="pt-BR"/>
+              </w:rPr>
+              <w:t xml:space="preserve">Cabo frouxo, elevação (°)</w:t>
             </w:r>
           </w:p>
         </w:tc>
@@ -23083,58 +23118,13 @@
                 <w:szCs w:val="20"/>
                 <w:lang w:val="pt-BR"/>
               </w:rPr>
-              <w:t xml:space="preserve">δ</w:t>
-            </w:r>
-            <w:r>
-              <w:rPr>
-                <w:b/>
-                <w:sz w:val="20"/>
-                <w:szCs w:val="20"/>
-                <w:vertAlign w:val="subscript"/>
-                <w:lang w:val="pt-BR"/>
-              </w:rPr>
-              <w:t xml:space="preserve">mín</w:t>
-            </w:r>
-            <w:r>
-              <w:rPr>
-                <w:b/>
-                <w:sz w:val="20"/>
-                <w:szCs w:val="20"/>
-                <w:lang w:val="pt-BR"/>
-              </w:rPr>
-              <w:t xml:space="preserve"> (mm)</w:t>
-            </w:r>
-          </w:p>
-        </w:tc>
-        <w:tc>
-          <w:tcPr>
-            <w:tcW w:w="1400" w:type="dxa"/>
-            <w:shd w:val="clear" w:color="auto" w:fill="F2F2F2"/>
-            <w:vAlign w:val="center"/>
-          </w:tcPr>
-          <w:p>
-            <w:pPr>
-              <w:keepNext/>
-              <w:spacing w:before="20" w:after="20" w:line="240" w:lineRule="auto"/>
-              <w:jc w:val="center"/>
-              <w:rPr>
-                <w:lang w:val="pt-BR"/>
-              </w:rPr>
-            </w:pPr>
-            <w:r>
-              <w:rPr>
-                <w:b/>
-                <w:sz w:val="20"/>
-                <w:szCs w:val="20"/>
-                <w:lang w:val="pt-BR"/>
-              </w:rPr>
               <w:t xml:space="preserve">Ponto morto (°)</w:t>
             </w:r>
           </w:p>
         </w:tc>
         <w:tc>
           <w:tcPr>
-            <w:tcW w:w="1360" w:type="dxa"/>
+            <w:tcW w:w="1460" w:type="dxa"/>
             <w:shd w:val="clear" w:color="auto" w:fill="F2F2F2"/>
             <w:vAlign w:val="center"/>
           </w:tcPr>
@@ -23175,7 +23165,7 @@
         </w:trPr>
         <w:tc>
           <w:tcPr>
-            <w:tcW w:w="1200" w:type="dxa"/>
+            <w:tcW w:w="1100" w:type="dxa"/>
             <w:vAlign w:val="center"/>
           </w:tcPr>
           <w:p>
@@ -23199,7 +23189,7 @@
         </w:tc>
         <w:tc>
           <w:tcPr>
-            <w:tcW w:w="1250" w:type="dxa"/>
+            <w:tcW w:w="1050" w:type="dxa"/>
             <w:vAlign w:val="center"/>
           </w:tcPr>
           <w:p>
@@ -23247,25 +23237,49 @@
         </w:tc>
         <w:tc>
           <w:tcPr>
-            <w:tcW w:w="1450" w:type="dxa"/>
-            <w:vAlign w:val="center"/>
-          </w:tcPr>
-          <w:p>
-            <w:pPr>
-              <w:keepNext/>
-              <w:spacing w:before="20" w:after="20" w:line="240" w:lineRule="auto"/>
-              <w:jc w:val="center"/>
-              <w:rPr>
-                <w:lang w:val="pt-BR"/>
-              </w:rPr>
-            </w:pPr>
-            <w:r>
-              <w:rPr>
-                <w:sz w:val="20"/>
-                <w:szCs w:val="20"/>
-                <w:lang w:val="pt-BR"/>
-              </w:rPr>
-              <w:t xml:space="preserve">108,8</w:t>
+            <w:tcW w:w="1150" w:type="dxa"/>
+            <w:vAlign w:val="center"/>
+          </w:tcPr>
+          <w:p>
+            <w:pPr>
+              <w:keepNext/>
+              <w:spacing w:before="20" w:after="20" w:line="240" w:lineRule="auto"/>
+              <w:jc w:val="center"/>
+              <w:rPr>
+                <w:lang w:val="pt-BR"/>
+              </w:rPr>
+            </w:pPr>
+            <w:r>
+              <w:rPr>
+                <w:sz w:val="20"/>
+                <w:szCs w:val="20"/>
+                <w:lang w:val="pt-BR"/>
+              </w:rPr>
+              <w:t xml:space="preserve">+29,20</w:t>
+            </w:r>
+          </w:p>
+        </w:tc>
+        <w:tc>
+          <w:tcPr>
+            <w:tcW w:w="1900" w:type="dxa"/>
+            <w:vAlign w:val="center"/>
+          </w:tcPr>
+          <w:p>
+            <w:pPr>
+              <w:keepNext/>
+              <w:spacing w:before="20" w:after="20" w:line="240" w:lineRule="auto"/>
+              <w:jc w:val="center"/>
+              <w:rPr>
+                <w:lang w:val="pt-BR"/>
+              </w:rPr>
+            </w:pPr>
+            <w:r>
+              <w:rPr>
+                <w:sz w:val="20"/>
+                <w:szCs w:val="20"/>
+                <w:lang w:val="pt-BR"/>
+              </w:rPr>
+              <w:t xml:space="preserve">nenhuma</w:t>
             </w:r>
           </w:p>
         </w:tc>
@@ -23289,37 +23303,13 @@
                 <w:szCs w:val="20"/>
                 <w:lang w:val="pt-BR"/>
               </w:rPr>
-              <w:t xml:space="preserve">29,20</w:t>
-            </w:r>
-          </w:p>
-        </w:tc>
-        <w:tc>
-          <w:tcPr>
-            <w:tcW w:w="1400" w:type="dxa"/>
-            <w:vAlign w:val="center"/>
-          </w:tcPr>
-          <w:p>
-            <w:pPr>
-              <w:keepNext/>
-              <w:spacing w:before="20" w:after="20" w:line="240" w:lineRule="auto"/>
-              <w:jc w:val="center"/>
-              <w:rPr>
-                <w:lang w:val="pt-BR"/>
-              </w:rPr>
-            </w:pPr>
-            <w:r>
-              <w:rPr>
-                <w:sz w:val="20"/>
-                <w:szCs w:val="20"/>
-                <w:lang w:val="pt-BR"/>
-              </w:rPr>
               <w:t xml:space="preserve">16,87</w:t>
             </w:r>
           </w:p>
         </w:tc>
         <w:tc>
           <w:tcPr>
-            <w:tcW w:w="1360" w:type="dxa"/>
+            <w:tcW w:w="1460" w:type="dxa"/>
             <w:vAlign w:val="center"/>
           </w:tcPr>
           <w:p>
@@ -23348,7 +23338,7 @@
         </w:trPr>
         <w:tc>
           <w:tcPr>
-            <w:tcW w:w="1200" w:type="dxa"/>
+            <w:tcW w:w="1100" w:type="dxa"/>
             <w:vAlign w:val="center"/>
           </w:tcPr>
           <w:p>
@@ -23372,7 +23362,7 @@
         </w:tc>
         <w:tc>
           <w:tcPr>
-            <w:tcW w:w="1250" w:type="dxa"/>
+            <w:tcW w:w="1050" w:type="dxa"/>
             <w:vAlign w:val="center"/>
           </w:tcPr>
           <w:p>
@@ -23420,25 +23410,49 @@
         </w:tc>
         <w:tc>
           <w:tcPr>
-            <w:tcW w:w="1450" w:type="dxa"/>
-            <w:vAlign w:val="center"/>
-          </w:tcPr>
-          <w:p>
-            <w:pPr>
-              <w:keepNext/>
-              <w:spacing w:before="20" w:after="20" w:line="240" w:lineRule="auto"/>
-              <w:jc w:val="center"/>
-              <w:rPr>
-                <w:lang w:val="pt-BR"/>
-              </w:rPr>
-            </w:pPr>
-            <w:r>
-              <w:rPr>
-                <w:sz w:val="20"/>
-                <w:szCs w:val="20"/>
-                <w:lang w:val="pt-BR"/>
-              </w:rPr>
-              <w:t xml:space="preserve">150,4</w:t>
+            <w:tcW w:w="1150" w:type="dxa"/>
+            <w:vAlign w:val="center"/>
+          </w:tcPr>
+          <w:p>
+            <w:pPr>
+              <w:keepNext/>
+              <w:spacing w:before="20" w:after="20" w:line="240" w:lineRule="auto"/>
+              <w:jc w:val="center"/>
+              <w:rPr>
+                <w:lang w:val="pt-BR"/>
+              </w:rPr>
+            </w:pPr>
+            <w:r>
+              <w:rPr>
+                <w:sz w:val="20"/>
+                <w:szCs w:val="20"/>
+                <w:lang w:val="pt-BR"/>
+              </w:rPr>
+              <w:t xml:space="preserve">+24,56</w:t>
+            </w:r>
+          </w:p>
+        </w:tc>
+        <w:tc>
+          <w:tcPr>
+            <w:tcW w:w="1900" w:type="dxa"/>
+            <w:vAlign w:val="center"/>
+          </w:tcPr>
+          <w:p>
+            <w:pPr>
+              <w:keepNext/>
+              <w:spacing w:before="20" w:after="20" w:line="240" w:lineRule="auto"/>
+              <w:jc w:val="center"/>
+              <w:rPr>
+                <w:lang w:val="pt-BR"/>
+              </w:rPr>
+            </w:pPr>
+            <w:r>
+              <w:rPr>
+                <w:sz w:val="20"/>
+                <w:szCs w:val="20"/>
+                <w:lang w:val="pt-BR"/>
+              </w:rPr>
+              <w:t xml:space="preserve">nenhuma</w:t>
             </w:r>
           </w:p>
         </w:tc>
@@ -23462,37 +23476,13 @@
                 <w:szCs w:val="20"/>
                 <w:lang w:val="pt-BR"/>
               </w:rPr>
-              <w:t xml:space="preserve">24,56</w:t>
-            </w:r>
-          </w:p>
-        </w:tc>
-        <w:tc>
-          <w:tcPr>
-            <w:tcW w:w="1400" w:type="dxa"/>
-            <w:vAlign w:val="center"/>
-          </w:tcPr>
-          <w:p>
-            <w:pPr>
-              <w:keepNext/>
-              <w:spacing w:before="20" w:after="20" w:line="240" w:lineRule="auto"/>
-              <w:jc w:val="center"/>
-              <w:rPr>
-                <w:lang w:val="pt-BR"/>
-              </w:rPr>
-            </w:pPr>
-            <w:r>
-              <w:rPr>
-                <w:sz w:val="20"/>
-                <w:szCs w:val="20"/>
-                <w:lang w:val="pt-BR"/>
-              </w:rPr>
               <w:t xml:space="preserve">23,67</w:t>
             </w:r>
           </w:p>
         </w:tc>
         <w:tc>
           <w:tcPr>
-            <w:tcW w:w="1360" w:type="dxa"/>
+            <w:tcW w:w="1460" w:type="dxa"/>
             <w:vAlign w:val="center"/>
           </w:tcPr>
           <w:p>
@@ -23521,7 +23511,7 @@
         </w:trPr>
         <w:tc>
           <w:tcPr>
-            <w:tcW w:w="1200" w:type="dxa"/>
+            <w:tcW w:w="1100" w:type="dxa"/>
             <w:vAlign w:val="center"/>
           </w:tcPr>
           <w:p>
@@ -23545,7 +23535,7 @@
         </w:tc>
         <w:tc>
           <w:tcPr>
-            <w:tcW w:w="1250" w:type="dxa"/>
+            <w:tcW w:w="1050" w:type="dxa"/>
             <w:vAlign w:val="center"/>
           </w:tcPr>
           <w:p>
@@ -23593,25 +23583,49 @@
         </w:tc>
         <w:tc>
           <w:tcPr>
-            <w:tcW w:w="1450" w:type="dxa"/>
-            <w:vAlign w:val="center"/>
-          </w:tcPr>
-          <w:p>
-            <w:pPr>
-              <w:keepNext/>
-              <w:spacing w:before="20" w:after="20" w:line="240" w:lineRule="auto"/>
-              <w:jc w:val="center"/>
-              <w:rPr>
-                <w:lang w:val="pt-BR"/>
-              </w:rPr>
-            </w:pPr>
-            <w:r>
-              <w:rPr>
-                <w:sz w:val="20"/>
-                <w:szCs w:val="20"/>
-                <w:lang w:val="pt-BR"/>
-              </w:rPr>
-              <w:t xml:space="preserve">189,0</w:t>
+            <w:tcW w:w="1150" w:type="dxa"/>
+            <w:vAlign w:val="center"/>
+          </w:tcPr>
+          <w:p>
+            <w:pPr>
+              <w:keepNext/>
+              <w:spacing w:before="20" w:after="20" w:line="240" w:lineRule="auto"/>
+              <w:jc w:val="center"/>
+              <w:rPr>
+                <w:lang w:val="pt-BR"/>
+              </w:rPr>
+            </w:pPr>
+            <w:r>
+              <w:rPr>
+                <w:sz w:val="20"/>
+                <w:szCs w:val="20"/>
+                <w:lang w:val="pt-BR"/>
+              </w:rPr>
+              <w:t xml:space="preserve">+19,90</w:t>
+            </w:r>
+          </w:p>
+        </w:tc>
+        <w:tc>
+          <w:tcPr>
+            <w:tcW w:w="1900" w:type="dxa"/>
+            <w:vAlign w:val="center"/>
+          </w:tcPr>
+          <w:p>
+            <w:pPr>
+              <w:keepNext/>
+              <w:spacing w:before="20" w:after="20" w:line="240" w:lineRule="auto"/>
+              <w:jc w:val="center"/>
+              <w:rPr>
+                <w:lang w:val="pt-BR"/>
+              </w:rPr>
+            </w:pPr>
+            <w:r>
+              <w:rPr>
+                <w:sz w:val="20"/>
+                <w:szCs w:val="20"/>
+                <w:lang w:val="pt-BR"/>
+              </w:rPr>
+              <w:t xml:space="preserve">nenhuma</w:t>
             </w:r>
           </w:p>
         </w:tc>
@@ -23635,37 +23649,13 @@
                 <w:szCs w:val="20"/>
                 <w:lang w:val="pt-BR"/>
               </w:rPr>
-              <w:t xml:space="preserve">19,90</w:t>
-            </w:r>
-          </w:p>
-        </w:tc>
-        <w:tc>
-          <w:tcPr>
-            <w:tcW w:w="1400" w:type="dxa"/>
-            <w:vAlign w:val="center"/>
-          </w:tcPr>
-          <w:p>
-            <w:pPr>
-              <w:keepNext/>
-              <w:spacing w:before="20" w:after="20" w:line="240" w:lineRule="auto"/>
-              <w:jc w:val="center"/>
-              <w:rPr>
-                <w:lang w:val="pt-BR"/>
-              </w:rPr>
-            </w:pPr>
-            <w:r>
-              <w:rPr>
-                <w:sz w:val="20"/>
-                <w:szCs w:val="20"/>
-                <w:lang w:val="pt-BR"/>
-              </w:rPr>
               <w:t xml:space="preserve">27,24</w:t>
             </w:r>
           </w:p>
         </w:tc>
         <w:tc>
           <w:tcPr>
-            <w:tcW w:w="1360" w:type="dxa"/>
+            <w:tcW w:w="1460" w:type="dxa"/>
             <w:vAlign w:val="center"/>
           </w:tcPr>
           <w:p>
@@ -23694,7 +23684,7 @@
         </w:trPr>
         <w:tc>
           <w:tcPr>
-            <w:tcW w:w="1200" w:type="dxa"/>
+            <w:tcW w:w="1100" w:type="dxa"/>
             <w:vAlign w:val="center"/>
           </w:tcPr>
           <w:p>
@@ -23718,7 +23708,7 @@
         </w:tc>
         <w:tc>
           <w:tcPr>
-            <w:tcW w:w="1250" w:type="dxa"/>
+            <w:tcW w:w="1050" w:type="dxa"/>
             <w:vAlign w:val="center"/>
           </w:tcPr>
           <w:p>
@@ -23766,25 +23756,49 @@
         </w:tc>
         <w:tc>
           <w:tcPr>
-            <w:tcW w:w="1450" w:type="dxa"/>
-            <w:vAlign w:val="center"/>
-          </w:tcPr>
-          <w:p>
-            <w:pPr>
-              <w:keepNext/>
-              <w:spacing w:before="20" w:after="20" w:line="240" w:lineRule="auto"/>
-              <w:jc w:val="center"/>
-              <w:rPr>
-                <w:lang w:val="pt-BR"/>
-              </w:rPr>
-            </w:pPr>
-            <w:r>
-              <w:rPr>
-                <w:sz w:val="20"/>
-                <w:szCs w:val="20"/>
-                <w:lang w:val="pt-BR"/>
-              </w:rPr>
-              <w:t xml:space="preserve">224,5</w:t>
+            <w:tcW w:w="1150" w:type="dxa"/>
+            <w:vAlign w:val="center"/>
+          </w:tcPr>
+          <w:p>
+            <w:pPr>
+              <w:keepNext/>
+              <w:spacing w:before="20" w:after="20" w:line="240" w:lineRule="auto"/>
+              <w:jc w:val="center"/>
+              <w:rPr>
+                <w:lang w:val="pt-BR"/>
+              </w:rPr>
+            </w:pPr>
+            <w:r>
+              <w:rPr>
+                <w:sz w:val="20"/>
+                <w:szCs w:val="20"/>
+                <w:lang w:val="pt-BR"/>
+              </w:rPr>
+              <w:t xml:space="preserve">+15,22</w:t>
+            </w:r>
+          </w:p>
+        </w:tc>
+        <w:tc>
+          <w:tcPr>
+            <w:tcW w:w="1900" w:type="dxa"/>
+            <w:vAlign w:val="center"/>
+          </w:tcPr>
+          <w:p>
+            <w:pPr>
+              <w:keepNext/>
+              <w:spacing w:before="20" w:after="20" w:line="240" w:lineRule="auto"/>
+              <w:jc w:val="center"/>
+              <w:rPr>
+                <w:lang w:val="pt-BR"/>
+              </w:rPr>
+            </w:pPr>
+            <w:r>
+              <w:rPr>
+                <w:sz w:val="20"/>
+                <w:szCs w:val="20"/>
+                <w:lang w:val="pt-BR"/>
+              </w:rPr>
+              <w:t xml:space="preserve">nenhuma</w:t>
             </w:r>
           </w:p>
         </w:tc>
@@ -23808,37 +23822,13 @@
                 <w:szCs w:val="20"/>
                 <w:lang w:val="pt-BR"/>
               </w:rPr>
-              <w:t xml:space="preserve">15,22</w:t>
-            </w:r>
-          </w:p>
-        </w:tc>
-        <w:tc>
-          <w:tcPr>
-            <w:tcW w:w="1400" w:type="dxa"/>
-            <w:vAlign w:val="center"/>
-          </w:tcPr>
-          <w:p>
-            <w:pPr>
-              <w:keepNext/>
-              <w:spacing w:before="20" w:after="20" w:line="240" w:lineRule="auto"/>
-              <w:jc w:val="center"/>
-              <w:rPr>
-                <w:lang w:val="pt-BR"/>
-              </w:rPr>
-            </w:pPr>
-            <w:r>
-              <w:rPr>
-                <w:sz w:val="20"/>
-                <w:szCs w:val="20"/>
-                <w:lang w:val="pt-BR"/>
-              </w:rPr>
               <w:t xml:space="preserve">29,43</w:t>
             </w:r>
           </w:p>
         </w:tc>
         <w:tc>
           <w:tcPr>
-            <w:tcW w:w="1360" w:type="dxa"/>
+            <w:tcW w:w="1460" w:type="dxa"/>
             <w:vAlign w:val="center"/>
           </w:tcPr>
           <w:p>
@@ -23867,7 +23857,7 @@
         </w:trPr>
         <w:tc>
           <w:tcPr>
-            <w:tcW w:w="1200" w:type="dxa"/>
+            <w:tcW w:w="1100" w:type="dxa"/>
             <w:vAlign w:val="center"/>
           </w:tcPr>
           <w:p>
@@ -23891,7 +23881,7 @@
         </w:tc>
         <w:tc>
           <w:tcPr>
-            <w:tcW w:w="1250" w:type="dxa"/>
+            <w:tcW w:w="1050" w:type="dxa"/>
             <w:vAlign w:val="center"/>
           </w:tcPr>
           <w:p>
@@ -23939,25 +23929,49 @@
         </w:tc>
         <w:tc>
           <w:tcPr>
-            <w:tcW w:w="1450" w:type="dxa"/>
-            <w:vAlign w:val="center"/>
-          </w:tcPr>
-          <w:p>
-            <w:pPr>
-              <w:keepNext/>
-              <w:spacing w:before="20" w:after="20" w:line="240" w:lineRule="auto"/>
-              <w:jc w:val="center"/>
-              <w:rPr>
-                <w:lang w:val="pt-BR"/>
-              </w:rPr>
-            </w:pPr>
-            <w:r>
-              <w:rPr>
-                <w:sz w:val="20"/>
-                <w:szCs w:val="20"/>
-                <w:lang w:val="pt-BR"/>
-              </w:rPr>
-              <w:t xml:space="preserve">246,5</w:t>
+            <w:tcW w:w="1150" w:type="dxa"/>
+            <w:vAlign w:val="center"/>
+          </w:tcPr>
+          <w:p>
+            <w:pPr>
+              <w:keepNext/>
+              <w:spacing w:before="20" w:after="20" w:line="240" w:lineRule="auto"/>
+              <w:jc w:val="center"/>
+              <w:rPr>
+                <w:lang w:val="pt-BR"/>
+              </w:rPr>
+            </w:pPr>
+            <w:r>
+              <w:rPr>
+                <w:sz w:val="20"/>
+                <w:szCs w:val="20"/>
+                <w:lang w:val="pt-BR"/>
+              </w:rPr>
+              <w:t xml:space="preserve">+12,04</w:t>
+            </w:r>
+          </w:p>
+        </w:tc>
+        <w:tc>
+          <w:tcPr>
+            <w:tcW w:w="1900" w:type="dxa"/>
+            <w:vAlign w:val="center"/>
+          </w:tcPr>
+          <w:p>
+            <w:pPr>
+              <w:keepNext/>
+              <w:spacing w:before="20" w:after="20" w:line="240" w:lineRule="auto"/>
+              <w:jc w:val="center"/>
+              <w:rPr>
+                <w:lang w:val="pt-BR"/>
+              </w:rPr>
+            </w:pPr>
+            <w:r>
+              <w:rPr>
+                <w:sz w:val="20"/>
+                <w:szCs w:val="20"/>
+                <w:lang w:val="pt-BR"/>
+              </w:rPr>
+              <w:t xml:space="preserve">nenhuma</w:t>
             </w:r>
           </w:p>
         </w:tc>
@@ -23981,37 +23995,13 @@
                 <w:szCs w:val="20"/>
                 <w:lang w:val="pt-BR"/>
               </w:rPr>
-              <w:t xml:space="preserve">12,04</w:t>
-            </w:r>
-          </w:p>
-        </w:tc>
-        <w:tc>
-          <w:tcPr>
-            <w:tcW w:w="1400" w:type="dxa"/>
-            <w:vAlign w:val="center"/>
-          </w:tcPr>
-          <w:p>
-            <w:pPr>
-              <w:keepNext/>
-              <w:spacing w:before="20" w:after="20" w:line="240" w:lineRule="auto"/>
-              <w:jc w:val="center"/>
-              <w:rPr>
-                <w:lang w:val="pt-BR"/>
-              </w:rPr>
-            </w:pPr>
-            <w:r>
-              <w:rPr>
-                <w:sz w:val="20"/>
-                <w:szCs w:val="20"/>
-                <w:lang w:val="pt-BR"/>
-              </w:rPr>
               <w:t xml:space="preserve">30,49</w:t>
             </w:r>
           </w:p>
         </w:tc>
         <w:tc>
           <w:tcPr>
-            <w:tcW w:w="1360" w:type="dxa"/>
+            <w:tcW w:w="1460" w:type="dxa"/>
             <w:vAlign w:val="center"/>
           </w:tcPr>
           <w:p>
@@ -24040,7 +24030,7 @@
         </w:trPr>
         <w:tc>
           <w:tcPr>
-            <w:tcW w:w="1200" w:type="dxa"/>
+            <w:tcW w:w="1100" w:type="dxa"/>
             <w:vAlign w:val="center"/>
           </w:tcPr>
           <w:p>
@@ -24064,7 +24054,7 @@
         </w:tc>
         <w:tc>
           <w:tcPr>
-            <w:tcW w:w="1250" w:type="dxa"/>
+            <w:tcW w:w="1050" w:type="dxa"/>
             <w:vAlign w:val="center"/>
           </w:tcPr>
           <w:p>
@@ -24112,25 +24102,49 @@
         </w:tc>
         <w:tc>
           <w:tcPr>
-            <w:tcW w:w="1450" w:type="dxa"/>
-            <w:vAlign w:val="center"/>
-          </w:tcPr>
-          <w:p>
-            <w:pPr>
-              <w:keepNext/>
-              <w:spacing w:before="20" w:after="20" w:line="240" w:lineRule="auto"/>
-              <w:jc w:val="center"/>
-              <w:rPr>
-                <w:lang w:val="pt-BR"/>
-              </w:rPr>
-            </w:pPr>
-            <w:r>
-              <w:rPr>
-                <w:sz w:val="20"/>
-                <w:szCs w:val="20"/>
-                <w:lang w:val="pt-BR"/>
-              </w:rPr>
-              <w:t xml:space="preserve">264,1</w:t>
+            <w:tcW w:w="1150" w:type="dxa"/>
+            <w:vAlign w:val="center"/>
+          </w:tcPr>
+          <w:p>
+            <w:pPr>
+              <w:keepNext/>
+              <w:spacing w:before="20" w:after="20" w:line="240" w:lineRule="auto"/>
+              <w:jc w:val="center"/>
+              <w:rPr>
+                <w:lang w:val="pt-BR"/>
+              </w:rPr>
+            </w:pPr>
+            <w:r>
+              <w:rPr>
+                <w:sz w:val="20"/>
+                <w:szCs w:val="20"/>
+                <w:lang w:val="pt-BR"/>
+              </w:rPr>
+              <w:t xml:space="preserve">+9,34</w:t>
+            </w:r>
+          </w:p>
+        </w:tc>
+        <w:tc>
+          <w:tcPr>
+            <w:tcW w:w="1900" w:type="dxa"/>
+            <w:vAlign w:val="center"/>
+          </w:tcPr>
+          <w:p>
+            <w:pPr>
+              <w:keepNext/>
+              <w:spacing w:before="20" w:after="20" w:line="240" w:lineRule="auto"/>
+              <w:jc w:val="center"/>
+              <w:rPr>
+                <w:lang w:val="pt-BR"/>
+              </w:rPr>
+            </w:pPr>
+            <w:r>
+              <w:rPr>
+                <w:sz w:val="20"/>
+                <w:szCs w:val="20"/>
+                <w:lang w:val="pt-BR"/>
+              </w:rPr>
+              <w:t xml:space="preserve">nenhuma</w:t>
             </w:r>
           </w:p>
         </w:tc>
@@ -24154,37 +24168,13 @@
                 <w:szCs w:val="20"/>
                 <w:lang w:val="pt-BR"/>
               </w:rPr>
-              <w:t xml:space="preserve">9,34</w:t>
-            </w:r>
-          </w:p>
-        </w:tc>
-        <w:tc>
-          <w:tcPr>
-            <w:tcW w:w="1400" w:type="dxa"/>
-            <w:vAlign w:val="center"/>
-          </w:tcPr>
-          <w:p>
-            <w:pPr>
-              <w:keepNext/>
-              <w:spacing w:before="20" w:after="20" w:line="240" w:lineRule="auto"/>
-              <w:jc w:val="center"/>
-              <w:rPr>
-                <w:lang w:val="pt-BR"/>
-              </w:rPr>
-            </w:pPr>
-            <w:r>
-              <w:rPr>
-                <w:sz w:val="20"/>
-                <w:szCs w:val="20"/>
-                <w:lang w:val="pt-BR"/>
-              </w:rPr>
               <w:t xml:space="preserve">31,20</w:t>
             </w:r>
           </w:p>
         </w:tc>
         <w:tc>
           <w:tcPr>
-            <w:tcW w:w="1360" w:type="dxa"/>
+            <w:tcW w:w="1460" w:type="dxa"/>
             <w:vAlign w:val="center"/>
           </w:tcPr>
           <w:p>
@@ -24213,7 +24203,7 @@
         </w:trPr>
         <w:tc>
           <w:tcPr>
-            <w:tcW w:w="1200" w:type="dxa"/>
+            <w:tcW w:w="1100" w:type="dxa"/>
             <w:vAlign w:val="center"/>
           </w:tcPr>
           <w:p>
@@ -24237,7 +24227,7 @@
         </w:tc>
         <w:tc>
           <w:tcPr>
-            <w:tcW w:w="1250" w:type="dxa"/>
+            <w:tcW w:w="1050" w:type="dxa"/>
             <w:vAlign w:val="center"/>
           </w:tcPr>
           <w:p>
@@ -24285,25 +24275,49 @@
         </w:tc>
         <w:tc>
           <w:tcPr>
-            <w:tcW w:w="1450" w:type="dxa"/>
-            <w:vAlign w:val="center"/>
-          </w:tcPr>
-          <w:p>
-            <w:pPr>
-              <w:keepNext/>
-              <w:spacing w:before="20" w:after="20" w:line="240" w:lineRule="auto"/>
-              <w:jc w:val="center"/>
-              <w:rPr>
-                <w:lang w:val="pt-BR"/>
-              </w:rPr>
-            </w:pPr>
-            <w:r>
-              <w:rPr>
-                <w:sz w:val="20"/>
-                <w:szCs w:val="20"/>
-                <w:lang w:val="pt-BR"/>
-              </w:rPr>
-              <w:t xml:space="preserve">285,4</w:t>
+            <w:tcW w:w="1150" w:type="dxa"/>
+            <w:vAlign w:val="center"/>
+          </w:tcPr>
+          <w:p>
+            <w:pPr>
+              <w:keepNext/>
+              <w:spacing w:before="20" w:after="20" w:line="240" w:lineRule="auto"/>
+              <w:jc w:val="center"/>
+              <w:rPr>
+                <w:lang w:val="pt-BR"/>
+              </w:rPr>
+            </w:pPr>
+            <w:r>
+              <w:rPr>
+                <w:sz w:val="20"/>
+                <w:szCs w:val="20"/>
+                <w:lang w:val="pt-BR"/>
+              </w:rPr>
+              <w:t xml:space="preserve">+5,79</w:t>
+            </w:r>
+          </w:p>
+        </w:tc>
+        <w:tc>
+          <w:tcPr>
+            <w:tcW w:w="1900" w:type="dxa"/>
+            <w:vAlign w:val="center"/>
+          </w:tcPr>
+          <w:p>
+            <w:pPr>
+              <w:keepNext/>
+              <w:spacing w:before="20" w:after="20" w:line="240" w:lineRule="auto"/>
+              <w:jc w:val="center"/>
+              <w:rPr>
+                <w:lang w:val="pt-BR"/>
+              </w:rPr>
+            </w:pPr>
+            <w:r>
+              <w:rPr>
+                <w:sz w:val="20"/>
+                <w:szCs w:val="20"/>
+                <w:lang w:val="pt-BR"/>
+              </w:rPr>
+              <w:t xml:space="preserve">nenhuma</w:t>
             </w:r>
           </w:p>
         </w:tc>
@@ -24327,37 +24341,13 @@
                 <w:szCs w:val="20"/>
                 <w:lang w:val="pt-BR"/>
               </w:rPr>
-              <w:t xml:space="preserve">5,79</w:t>
-            </w:r>
-          </w:p>
-        </w:tc>
-        <w:tc>
-          <w:tcPr>
-            <w:tcW w:w="1400" w:type="dxa"/>
-            <w:vAlign w:val="center"/>
-          </w:tcPr>
-          <w:p>
-            <w:pPr>
-              <w:keepNext/>
-              <w:spacing w:before="20" w:after="20" w:line="240" w:lineRule="auto"/>
-              <w:jc w:val="center"/>
-              <w:rPr>
-                <w:lang w:val="pt-BR"/>
-              </w:rPr>
-            </w:pPr>
-            <w:r>
-              <w:rPr>
-                <w:sz w:val="20"/>
-                <w:szCs w:val="20"/>
-                <w:lang w:val="pt-BR"/>
-              </w:rPr>
               <w:t xml:space="preserve">31,97</w:t>
             </w:r>
           </w:p>
         </w:tc>
         <w:tc>
           <w:tcPr>
-            <w:tcW w:w="1360" w:type="dxa"/>
+            <w:tcW w:w="1460" w:type="dxa"/>
             <w:vAlign w:val="center"/>
           </w:tcPr>
           <w:p>
@@ -24386,7 +24376,7 @@
         </w:trPr>
         <w:tc>
           <w:tcPr>
-            <w:tcW w:w="1200" w:type="dxa"/>
+            <w:tcW w:w="1100" w:type="dxa"/>
             <w:vAlign w:val="center"/>
           </w:tcPr>
           <w:p>
@@ -24410,7 +24400,7 @@
         </w:tc>
         <w:tc>
           <w:tcPr>
-            <w:tcW w:w="1250" w:type="dxa"/>
+            <w:tcW w:w="1050" w:type="dxa"/>
             <w:vAlign w:val="center"/>
           </w:tcPr>
           <w:p>
@@ -24458,25 +24448,49 @@
         </w:tc>
         <w:tc>
           <w:tcPr>
-            <w:tcW w:w="1450" w:type="dxa"/>
-            <w:vAlign w:val="center"/>
-          </w:tcPr>
-          <w:p>
-            <w:pPr>
-              <w:keepNext/>
-              <w:spacing w:before="20" w:after="20" w:line="240" w:lineRule="auto"/>
-              <w:jc w:val="center"/>
-              <w:rPr>
-                <w:lang w:val="pt-BR"/>
-              </w:rPr>
-            </w:pPr>
-            <w:r>
-              <w:rPr>
-                <w:sz w:val="20"/>
-                <w:szCs w:val="20"/>
-                <w:lang w:val="pt-BR"/>
-              </w:rPr>
-              <w:t xml:space="preserve">298,5</w:t>
+            <w:tcW w:w="1150" w:type="dxa"/>
+            <w:vAlign w:val="center"/>
+          </w:tcPr>
+          <w:p>
+            <w:pPr>
+              <w:keepNext/>
+              <w:spacing w:before="20" w:after="20" w:line="240" w:lineRule="auto"/>
+              <w:jc w:val="center"/>
+              <w:rPr>
+                <w:lang w:val="pt-BR"/>
+              </w:rPr>
+            </w:pPr>
+            <w:r>
+              <w:rPr>
+                <w:sz w:val="20"/>
+                <w:szCs w:val="20"/>
+                <w:lang w:val="pt-BR"/>
+              </w:rPr>
+              <w:t xml:space="preserve">+3,42</w:t>
+            </w:r>
+          </w:p>
+        </w:tc>
+        <w:tc>
+          <w:tcPr>
+            <w:tcW w:w="1900" w:type="dxa"/>
+            <w:vAlign w:val="center"/>
+          </w:tcPr>
+          <w:p>
+            <w:pPr>
+              <w:keepNext/>
+              <w:spacing w:before="20" w:after="20" w:line="240" w:lineRule="auto"/>
+              <w:jc w:val="center"/>
+              <w:rPr>
+                <w:lang w:val="pt-BR"/>
+              </w:rPr>
+            </w:pPr>
+            <w:r>
+              <w:rPr>
+                <w:sz w:val="20"/>
+                <w:szCs w:val="20"/>
+                <w:lang w:val="pt-BR"/>
+              </w:rPr>
+              <w:t xml:space="preserve">nenhuma</w:t>
             </w:r>
           </w:p>
         </w:tc>
@@ -24500,37 +24514,13 @@
                 <w:szCs w:val="20"/>
                 <w:lang w:val="pt-BR"/>
               </w:rPr>
-              <w:t xml:space="preserve">3,42</w:t>
-            </w:r>
-          </w:p>
-        </w:tc>
-        <w:tc>
-          <w:tcPr>
-            <w:tcW w:w="1400" w:type="dxa"/>
-            <w:vAlign w:val="center"/>
-          </w:tcPr>
-          <w:p>
-            <w:pPr>
-              <w:keepNext/>
-              <w:spacing w:before="20" w:after="20" w:line="240" w:lineRule="auto"/>
-              <w:jc w:val="center"/>
-              <w:rPr>
-                <w:lang w:val="pt-BR"/>
-              </w:rPr>
-            </w:pPr>
-            <w:r>
-              <w:rPr>
-                <w:sz w:val="20"/>
-                <w:szCs w:val="20"/>
-                <w:lang w:val="pt-BR"/>
-              </w:rPr>
               <w:t xml:space="preserve">32,39</w:t>
             </w:r>
           </w:p>
         </w:tc>
         <w:tc>
           <w:tcPr>
-            <w:tcW w:w="1360" w:type="dxa"/>
+            <w:tcW w:w="1460" w:type="dxa"/>
             <w:vAlign w:val="center"/>
           </w:tcPr>
           <w:p>
@@ -24559,7 +24549,7 @@
         </w:trPr>
         <w:tc>
           <w:tcPr>
-            <w:tcW w:w="1200" w:type="dxa"/>
+            <w:tcW w:w="1100" w:type="dxa"/>
             <w:vAlign w:val="center"/>
           </w:tcPr>
           <w:p>
@@ -24583,7 +24573,7 @@
         </w:tc>
         <w:tc>
           <w:tcPr>
-            <w:tcW w:w="1250" w:type="dxa"/>
+            <w:tcW w:w="1050" w:type="dxa"/>
             <w:vAlign w:val="center"/>
           </w:tcPr>
           <w:p>
@@ -24631,25 +24621,49 @@
         </w:tc>
         <w:tc>
           <w:tcPr>
-            <w:tcW w:w="1450" w:type="dxa"/>
-            <w:vAlign w:val="center"/>
-          </w:tcPr>
-          <w:p>
-            <w:pPr>
-              <w:keepNext/>
-              <w:spacing w:before="20" w:after="20" w:line="240" w:lineRule="auto"/>
-              <w:jc w:val="center"/>
-              <w:rPr>
-                <w:lang w:val="pt-BR"/>
-              </w:rPr>
-            </w:pPr>
-            <w:r>
-              <w:rPr>
-                <w:sz w:val="20"/>
-                <w:szCs w:val="20"/>
-                <w:lang w:val="pt-BR"/>
-              </w:rPr>
-              <w:t xml:space="preserve">315,9</w:t>
+            <w:tcW w:w="1150" w:type="dxa"/>
+            <w:vAlign w:val="center"/>
+          </w:tcPr>
+          <w:p>
+            <w:pPr>
+              <w:keepNext/>
+              <w:spacing w:before="20" w:after="20" w:line="240" w:lineRule="auto"/>
+              <w:jc w:val="center"/>
+              <w:rPr>
+                <w:lang w:val="pt-BR"/>
+              </w:rPr>
+            </w:pPr>
+            <w:r>
+              <w:rPr>
+                <w:sz w:val="20"/>
+                <w:szCs w:val="20"/>
+                <w:lang w:val="pt-BR"/>
+              </w:rPr>
+              <w:t xml:space="preserve">0,00</w:t>
+            </w:r>
+          </w:p>
+        </w:tc>
+        <w:tc>
+          <w:tcPr>
+            <w:tcW w:w="1900" w:type="dxa"/>
+            <w:vAlign w:val="center"/>
+          </w:tcPr>
+          <w:p>
+            <w:pPr>
+              <w:keepNext/>
+              <w:spacing w:before="20" w:after="20" w:line="240" w:lineRule="auto"/>
+              <w:jc w:val="center"/>
+              <w:rPr>
+                <w:lang w:val="pt-BR"/>
+              </w:rPr>
+            </w:pPr>
+            <w:r>
+              <w:rPr>
+                <w:sz w:val="20"/>
+                <w:szCs w:val="20"/>
+                <w:lang w:val="pt-BR"/>
+              </w:rPr>
+              <w:t xml:space="preserve">nenhuma</w:t>
             </w:r>
           </w:p>
         </w:tc>
@@ -24673,7 +24687,84 @@
                 <w:szCs w:val="20"/>
                 <w:lang w:val="pt-BR"/>
               </w:rPr>
-              <w:t xml:space="preserve">0,00</w:t>
+              <w:t xml:space="preserve">32,92</w:t>
+            </w:r>
+          </w:p>
+        </w:tc>
+        <w:tc>
+          <w:tcPr>
+            <w:tcW w:w="1460" w:type="dxa"/>
+            <w:vAlign w:val="center"/>
+          </w:tcPr>
+          <w:p>
+            <w:pPr>
+              <w:keepNext/>
+              <w:spacing w:before="20" w:after="20" w:line="240" w:lineRule="auto"/>
+              <w:jc w:val="center"/>
+              <w:rPr>
+                <w:lang w:val="pt-BR"/>
+              </w:rPr>
+            </w:pPr>
+            <w:r>
+              <w:rPr>
+                <w:sz w:val="20"/>
+                <w:szCs w:val="20"/>
+                <w:lang w:val="pt-BR"/>
+              </w:rPr>
+              <w:t xml:space="preserve">10.511</w:t>
+            </w:r>
+          </w:p>
+        </w:tc>
+      </w:tr>
+      <w:tr>
+        <w:trPr>
+          <w:cantSplit/>
+        </w:trPr>
+        <w:tc>
+          <w:tcPr>
+            <w:tcW w:w="1100" w:type="dxa"/>
+            <w:vAlign w:val="center"/>
+          </w:tcPr>
+          <w:p>
+            <w:pPr>
+              <w:keepNext/>
+              <w:spacing w:before="20" w:after="20" w:line="240" w:lineRule="auto"/>
+              <w:jc w:val="center"/>
+              <w:rPr>
+                <w:lang w:val="pt-BR"/>
+              </w:rPr>
+            </w:pPr>
+            <w:r>
+              <w:rPr>
+                <w:sz w:val="20"/>
+                <w:szCs w:val="20"/>
+                <w:lang w:val="pt-BR"/>
+              </w:rPr>
+              <w:t xml:space="preserve">35,000</w:t>
+            </w:r>
+          </w:p>
+        </w:tc>
+        <w:tc>
+          <w:tcPr>
+            <w:tcW w:w="1050" w:type="dxa"/>
+            <w:vAlign w:val="center"/>
+          </w:tcPr>
+          <w:p>
+            <w:pPr>
+              <w:keepNext/>
+              <w:spacing w:before="20" w:after="20" w:line="240" w:lineRule="auto"/>
+              <w:jc w:val="center"/>
+              <w:rPr>
+                <w:lang w:val="pt-BR"/>
+              </w:rPr>
+            </w:pPr>
+            <w:r>
+              <w:rPr>
+                <w:sz w:val="20"/>
+                <w:szCs w:val="20"/>
+                <w:lang w:val="pt-BR"/>
+              </w:rPr>
+              <w:t xml:space="preserve">225,7</w:t>
             </w:r>
           </w:p>
         </w:tc>
@@ -24697,31 +24788,968 @@
                 <w:szCs w:val="20"/>
                 <w:lang w:val="pt-BR"/>
               </w:rPr>
-              <w:t xml:space="preserve">32,92</w:t>
-            </w:r>
-          </w:p>
-        </w:tc>
-        <w:tc>
-          <w:tcPr>
-            <w:tcW w:w="1360" w:type="dxa"/>
-            <w:vAlign w:val="center"/>
-          </w:tcPr>
-          <w:p>
-            <w:pPr>
-              <w:keepNext/>
-              <w:spacing w:before="20" w:after="20" w:line="240" w:lineRule="auto"/>
-              <w:jc w:val="center"/>
-              <w:rPr>
-                <w:lang w:val="pt-BR"/>
-              </w:rPr>
-            </w:pPr>
-            <w:r>
-              <w:rPr>
-                <w:sz w:val="20"/>
-                <w:szCs w:val="20"/>
-                <w:lang w:val="pt-BR"/>
-              </w:rPr>
-              <w:t xml:space="preserve">10.511</w:t>
+              <w:t xml:space="preserve">170,8</w:t>
+            </w:r>
+          </w:p>
+        </w:tc>
+        <w:tc>
+          <w:tcPr>
+            <w:tcW w:w="1150" w:type="dxa"/>
+            <w:vAlign w:val="center"/>
+          </w:tcPr>
+          <w:p>
+            <w:pPr>
+              <w:keepNext/>
+              <w:spacing w:before="20" w:after="20" w:line="240" w:lineRule="auto"/>
+              <w:jc w:val="center"/>
+              <w:rPr>
+                <w:lang w:val="pt-BR"/>
+              </w:rPr>
+            </w:pPr>
+            <w:r>
+              <w:rPr>
+                <w:sz w:val="20"/>
+                <w:szCs w:val="20"/>
+                <w:lang w:val="pt-BR"/>
+              </w:rPr>
+              <w:t xml:space="preserve">−2,51</w:t>
+            </w:r>
+          </w:p>
+        </w:tc>
+        <w:tc>
+          <w:tcPr>
+            <w:tcW w:w="1900" w:type="dxa"/>
+            <w:vAlign w:val="center"/>
+          </w:tcPr>
+          <w:p>
+            <w:pPr>
+              <w:keepNext/>
+              <w:spacing w:before="20" w:after="20" w:line="240" w:lineRule="auto"/>
+              <w:jc w:val="center"/>
+              <w:rPr>
+                <w:lang w:val="pt-BR"/>
+              </w:rPr>
+            </w:pPr>
+            <w:r>
+              <w:rPr>
+                <w:sz w:val="20"/>
+                <w:szCs w:val="20"/>
+                <w:lang w:val="pt-BR"/>
+              </w:rPr>
+              <w:t xml:space="preserve">173,8 a 180,1</w:t>
+            </w:r>
+          </w:p>
+        </w:tc>
+        <w:tc>
+          <w:tcPr>
+            <w:tcW w:w="1300" w:type="dxa"/>
+            <w:vAlign w:val="center"/>
+          </w:tcPr>
+          <w:p>
+            <w:pPr>
+              <w:keepNext/>
+              <w:spacing w:before="20" w:after="20" w:line="240" w:lineRule="auto"/>
+              <w:jc w:val="center"/>
+              <w:rPr>
+                <w:lang w:val="pt-BR"/>
+              </w:rPr>
+            </w:pPr>
+            <w:r>
+              <w:rPr>
+                <w:sz w:val="20"/>
+                <w:szCs w:val="20"/>
+                <w:lang w:val="pt-BR"/>
+              </w:rPr>
+              <w:t xml:space="preserve">33,25</w:t>
+            </w:r>
+          </w:p>
+        </w:tc>
+        <w:tc>
+          <w:tcPr>
+            <w:tcW w:w="1460" w:type="dxa"/>
+            <w:vAlign w:val="center"/>
+          </w:tcPr>
+          <w:p>
+            <w:pPr>
+              <w:keepNext/>
+              <w:spacing w:before="20" w:after="20" w:line="240" w:lineRule="auto"/>
+              <w:jc w:val="center"/>
+              <w:rPr>
+                <w:lang w:val="pt-BR"/>
+              </w:rPr>
+            </w:pPr>
+            <w:r>
+              <w:rPr>
+                <w:sz w:val="20"/>
+                <w:szCs w:val="20"/>
+                <w:lang w:val="pt-BR"/>
+              </w:rPr>
+              <w:t xml:space="preserve">10.712</w:t>
+            </w:r>
+          </w:p>
+        </w:tc>
+      </w:tr>
+      <w:tr>
+        <w:trPr>
+          <w:cantSplit/>
+        </w:trPr>
+        <w:tc>
+          <w:tcPr>
+            <w:tcW w:w="1100" w:type="dxa"/>
+            <w:vAlign w:val="center"/>
+          </w:tcPr>
+          <w:p>
+            <w:pPr>
+              <w:keepNext/>
+              <w:spacing w:before="20" w:after="20" w:line="240" w:lineRule="auto"/>
+              <w:jc w:val="center"/>
+              <w:rPr>
+                <w:lang w:val="pt-BR"/>
+              </w:rPr>
+            </w:pPr>
+            <w:r>
+              <w:rPr>
+                <w:sz w:val="20"/>
+                <w:szCs w:val="20"/>
+                <w:lang w:val="pt-BR"/>
+              </w:rPr>
+              <w:t xml:space="preserve">40,000</w:t>
+            </w:r>
+          </w:p>
+        </w:tc>
+        <w:tc>
+          <w:tcPr>
+            <w:tcW w:w="1050" w:type="dxa"/>
+            <w:vAlign w:val="center"/>
+          </w:tcPr>
+          <w:p>
+            <w:pPr>
+              <w:keepNext/>
+              <w:spacing w:before="20" w:after="20" w:line="240" w:lineRule="auto"/>
+              <w:jc w:val="center"/>
+              <w:rPr>
+                <w:lang w:val="pt-BR"/>
+              </w:rPr>
+            </w:pPr>
+            <w:r>
+              <w:rPr>
+                <w:sz w:val="20"/>
+                <w:szCs w:val="20"/>
+                <w:lang w:val="pt-BR"/>
+              </w:rPr>
+              <w:t xml:space="preserve">258,7</w:t>
+            </w:r>
+          </w:p>
+        </w:tc>
+        <w:tc>
+          <w:tcPr>
+            <w:tcW w:w="1400" w:type="dxa"/>
+            <w:vAlign w:val="center"/>
+          </w:tcPr>
+          <w:p>
+            <w:pPr>
+              <w:keepNext/>
+              <w:spacing w:before="20" w:after="20" w:line="240" w:lineRule="auto"/>
+              <w:jc w:val="center"/>
+              <w:rPr>
+                <w:lang w:val="pt-BR"/>
+              </w:rPr>
+            </w:pPr>
+            <w:r>
+              <w:rPr>
+                <w:sz w:val="20"/>
+                <w:szCs w:val="20"/>
+                <w:lang w:val="pt-BR"/>
+              </w:rPr>
+              <w:t xml:space="preserve">186,4</w:t>
+            </w:r>
+          </w:p>
+        </w:tc>
+        <w:tc>
+          <w:tcPr>
+            <w:tcW w:w="1150" w:type="dxa"/>
+            <w:vAlign w:val="center"/>
+          </w:tcPr>
+          <w:p>
+            <w:pPr>
+              <w:keepNext/>
+              <w:spacing w:before="20" w:after="20" w:line="240" w:lineRule="auto"/>
+              <w:jc w:val="center"/>
+              <w:rPr>
+                <w:lang w:val="pt-BR"/>
+              </w:rPr>
+            </w:pPr>
+            <w:r>
+              <w:rPr>
+                <w:sz w:val="20"/>
+                <w:szCs w:val="20"/>
+                <w:lang w:val="pt-BR"/>
+              </w:rPr>
+              <w:t xml:space="preserve">−8,47</w:t>
+            </w:r>
+          </w:p>
+        </w:tc>
+        <w:tc>
+          <w:tcPr>
+            <w:tcW w:w="1900" w:type="dxa"/>
+            <w:vAlign w:val="center"/>
+          </w:tcPr>
+          <w:p>
+            <w:pPr>
+              <w:keepNext/>
+              <w:spacing w:before="20" w:after="20" w:line="240" w:lineRule="auto"/>
+              <w:jc w:val="center"/>
+              <w:rPr>
+                <w:lang w:val="pt-BR"/>
+              </w:rPr>
+            </w:pPr>
+            <w:r>
+              <w:rPr>
+                <w:sz w:val="20"/>
+                <w:szCs w:val="20"/>
+                <w:lang w:val="pt-BR"/>
+              </w:rPr>
+              <w:t xml:space="preserve">163,7 a 180,1</w:t>
+            </w:r>
+          </w:p>
+        </w:tc>
+        <w:tc>
+          <w:tcPr>
+            <w:tcW w:w="1300" w:type="dxa"/>
+            <w:vAlign w:val="center"/>
+          </w:tcPr>
+          <w:p>
+            <w:pPr>
+              <w:keepNext/>
+              <w:spacing w:before="20" w:after="20" w:line="240" w:lineRule="auto"/>
+              <w:jc w:val="center"/>
+              <w:rPr>
+                <w:lang w:val="pt-BR"/>
+              </w:rPr>
+            </w:pPr>
+            <w:r>
+              <w:rPr>
+                <w:sz w:val="20"/>
+                <w:szCs w:val="20"/>
+                <w:lang w:val="pt-BR"/>
+              </w:rPr>
+              <w:t xml:space="preserve">33,89</w:t>
+            </w:r>
+          </w:p>
+        </w:tc>
+        <w:tc>
+          <w:tcPr>
+            <w:tcW w:w="1460" w:type="dxa"/>
+            <w:vAlign w:val="center"/>
+          </w:tcPr>
+          <w:p>
+            <w:pPr>
+              <w:keepNext/>
+              <w:spacing w:before="20" w:after="20" w:line="240" w:lineRule="auto"/>
+              <w:jc w:val="center"/>
+              <w:rPr>
+                <w:lang w:val="pt-BR"/>
+              </w:rPr>
+            </w:pPr>
+            <w:r>
+              <w:rPr>
+                <w:sz w:val="20"/>
+                <w:szCs w:val="20"/>
+                <w:lang w:val="pt-BR"/>
+              </w:rPr>
+              <w:t xml:space="preserve">11.180</w:t>
+            </w:r>
+          </w:p>
+        </w:tc>
+      </w:tr>
+      <w:tr>
+        <w:trPr>
+          <w:cantSplit/>
+        </w:trPr>
+        <w:tc>
+          <w:tcPr>
+            <w:tcW w:w="1100" w:type="dxa"/>
+            <w:vAlign w:val="center"/>
+          </w:tcPr>
+          <w:p>
+            <w:pPr>
+              <w:keepNext/>
+              <w:spacing w:before="20" w:after="20" w:line="240" w:lineRule="auto"/>
+              <w:jc w:val="center"/>
+              <w:rPr>
+                <w:lang w:val="pt-BR"/>
+              </w:rPr>
+            </w:pPr>
+            <w:r>
+              <w:rPr>
+                <w:sz w:val="20"/>
+                <w:szCs w:val="20"/>
+                <w:lang w:val="pt-BR"/>
+              </w:rPr>
+              <w:t xml:space="preserve">50,000</w:t>
+            </w:r>
+          </w:p>
+        </w:tc>
+        <w:tc>
+          <w:tcPr>
+            <w:tcW w:w="1050" w:type="dxa"/>
+            <w:vAlign w:val="center"/>
+          </w:tcPr>
+          <w:p>
+            <w:pPr>
+              <w:keepNext/>
+              <w:spacing w:before="20" w:after="20" w:line="240" w:lineRule="auto"/>
+              <w:jc w:val="center"/>
+              <w:rPr>
+                <w:lang w:val="pt-BR"/>
+              </w:rPr>
+            </w:pPr>
+            <w:r>
+              <w:rPr>
+                <w:sz w:val="20"/>
+                <w:szCs w:val="20"/>
+                <w:lang w:val="pt-BR"/>
+              </w:rPr>
+              <w:t xml:space="preserve">326,5</w:t>
+            </w:r>
+          </w:p>
+        </w:tc>
+        <w:tc>
+          <w:tcPr>
+            <w:tcW w:w="1400" w:type="dxa"/>
+            <w:vAlign w:val="center"/>
+          </w:tcPr>
+          <w:p>
+            <w:pPr>
+              <w:keepNext/>
+              <w:spacing w:before="20" w:after="20" w:line="240" w:lineRule="auto"/>
+              <w:jc w:val="center"/>
+              <w:rPr>
+                <w:lang w:val="pt-BR"/>
+              </w:rPr>
+            </w:pPr>
+            <w:r>
+              <w:rPr>
+                <w:sz w:val="20"/>
+                <w:szCs w:val="20"/>
+                <w:lang w:val="pt-BR"/>
+              </w:rPr>
+              <w:t xml:space="preserve">211,3</w:t>
+            </w:r>
+          </w:p>
+        </w:tc>
+        <w:tc>
+          <w:tcPr>
+            <w:tcW w:w="1150" w:type="dxa"/>
+            <w:vAlign w:val="center"/>
+          </w:tcPr>
+          <w:p>
+            <w:pPr>
+              <w:keepNext/>
+              <w:spacing w:before="20" w:after="20" w:line="240" w:lineRule="auto"/>
+              <w:jc w:val="center"/>
+              <w:rPr>
+                <w:lang w:val="pt-BR"/>
+              </w:rPr>
+            </w:pPr>
+            <w:r>
+              <w:rPr>
+                <w:sz w:val="20"/>
+                <w:szCs w:val="20"/>
+                <w:lang w:val="pt-BR"/>
+              </w:rPr>
+              <w:t xml:space="preserve">−20,44</w:t>
+            </w:r>
+          </w:p>
+        </w:tc>
+        <w:tc>
+          <w:tcPr>
+            <w:tcW w:w="1900" w:type="dxa"/>
+            <w:vAlign w:val="center"/>
+          </w:tcPr>
+          <w:p>
+            <w:pPr>
+              <w:keepNext/>
+              <w:spacing w:before="20" w:after="20" w:line="240" w:lineRule="auto"/>
+              <w:jc w:val="center"/>
+              <w:rPr>
+                <w:lang w:val="pt-BR"/>
+              </w:rPr>
+            </w:pPr>
+            <w:r>
+              <w:rPr>
+                <w:sz w:val="20"/>
+                <w:szCs w:val="20"/>
+                <w:lang w:val="pt-BR"/>
+              </w:rPr>
+              <w:t xml:space="preserve">151,9 a 180,1</w:t>
+            </w:r>
+          </w:p>
+        </w:tc>
+        <w:tc>
+          <w:tcPr>
+            <w:tcW w:w="1300" w:type="dxa"/>
+            <w:vAlign w:val="center"/>
+          </w:tcPr>
+          <w:p>
+            <w:pPr>
+              <w:keepNext/>
+              <w:spacing w:before="20" w:after="20" w:line="240" w:lineRule="auto"/>
+              <w:jc w:val="center"/>
+              <w:rPr>
+                <w:lang w:val="pt-BR"/>
+              </w:rPr>
+            </w:pPr>
+            <w:r>
+              <w:rPr>
+                <w:sz w:val="20"/>
+                <w:szCs w:val="20"/>
+                <w:lang w:val="pt-BR"/>
+              </w:rPr>
+              <w:t xml:space="preserve">34,79</w:t>
+            </w:r>
+          </w:p>
+        </w:tc>
+        <w:tc>
+          <w:tcPr>
+            <w:tcW w:w="1460" w:type="dxa"/>
+            <w:vAlign w:val="center"/>
+          </w:tcPr>
+          <w:p>
+            <w:pPr>
+              <w:keepNext/>
+              <w:spacing w:before="20" w:after="20" w:line="240" w:lineRule="auto"/>
+              <w:jc w:val="center"/>
+              <w:rPr>
+                <w:lang w:val="pt-BR"/>
+              </w:rPr>
+            </w:pPr>
+            <w:r>
+              <w:rPr>
+                <w:sz w:val="20"/>
+                <w:szCs w:val="20"/>
+                <w:lang w:val="pt-BR"/>
+              </w:rPr>
+              <w:t xml:space="preserve">12.084</w:t>
+            </w:r>
+          </w:p>
+        </w:tc>
+      </w:tr>
+      <w:tr>
+        <w:trPr>
+          <w:cantSplit/>
+        </w:trPr>
+        <w:tc>
+          <w:tcPr>
+            <w:tcW w:w="1100" w:type="dxa"/>
+            <w:vAlign w:val="center"/>
+          </w:tcPr>
+          <w:p>
+            <w:pPr>
+              <w:keepNext/>
+              <w:spacing w:before="20" w:after="20" w:line="240" w:lineRule="auto"/>
+              <w:jc w:val="center"/>
+              <w:rPr>
+                <w:lang w:val="pt-BR"/>
+              </w:rPr>
+            </w:pPr>
+            <w:r>
+              <w:rPr>
+                <w:sz w:val="20"/>
+                <w:szCs w:val="20"/>
+                <w:lang w:val="pt-BR"/>
+              </w:rPr>
+              <w:t xml:space="preserve">60,000</w:t>
+            </w:r>
+          </w:p>
+        </w:tc>
+        <w:tc>
+          <w:tcPr>
+            <w:tcW w:w="1050" w:type="dxa"/>
+            <w:vAlign w:val="center"/>
+          </w:tcPr>
+          <w:p>
+            <w:pPr>
+              <w:keepNext/>
+              <w:spacing w:before="20" w:after="20" w:line="240" w:lineRule="auto"/>
+              <w:jc w:val="center"/>
+              <w:rPr>
+                <w:lang w:val="pt-BR"/>
+              </w:rPr>
+            </w:pPr>
+            <w:r>
+              <w:rPr>
+                <w:sz w:val="20"/>
+                <w:szCs w:val="20"/>
+                <w:lang w:val="pt-BR"/>
+              </w:rPr>
+              <w:t xml:space="preserve">396,2</w:t>
+            </w:r>
+          </w:p>
+        </w:tc>
+        <w:tc>
+          <w:tcPr>
+            <w:tcW w:w="1400" w:type="dxa"/>
+            <w:vAlign w:val="center"/>
+          </w:tcPr>
+          <w:p>
+            <w:pPr>
+              <w:keepNext/>
+              <w:spacing w:before="20" w:after="20" w:line="240" w:lineRule="auto"/>
+              <w:jc w:val="center"/>
+              <w:rPr>
+                <w:lang w:val="pt-BR"/>
+              </w:rPr>
+            </w:pPr>
+            <w:r>
+              <w:rPr>
+                <w:sz w:val="20"/>
+                <w:szCs w:val="20"/>
+                <w:lang w:val="pt-BR"/>
+              </w:rPr>
+              <w:t xml:space="preserve">230,5</w:t>
+            </w:r>
+          </w:p>
+        </w:tc>
+        <w:tc>
+          <w:tcPr>
+            <w:tcW w:w="1150" w:type="dxa"/>
+            <w:vAlign w:val="center"/>
+          </w:tcPr>
+          <w:p>
+            <w:pPr>
+              <w:keepNext/>
+              <w:spacing w:before="20" w:after="20" w:line="240" w:lineRule="auto"/>
+              <w:jc w:val="center"/>
+              <w:rPr>
+                <w:lang w:val="pt-BR"/>
+              </w:rPr>
+            </w:pPr>
+            <w:r>
+              <w:rPr>
+                <w:sz w:val="20"/>
+                <w:szCs w:val="20"/>
+                <w:lang w:val="pt-BR"/>
+              </w:rPr>
+              <w:t xml:space="preserve">−32,46</w:t>
+            </w:r>
+          </w:p>
+        </w:tc>
+        <w:tc>
+          <w:tcPr>
+            <w:tcW w:w="1900" w:type="dxa"/>
+            <w:vAlign w:val="center"/>
+          </w:tcPr>
+          <w:p>
+            <w:pPr>
+              <w:keepNext/>
+              <w:spacing w:before="20" w:after="20" w:line="240" w:lineRule="auto"/>
+              <w:jc w:val="center"/>
+              <w:rPr>
+                <w:lang w:val="pt-BR"/>
+              </w:rPr>
+            </w:pPr>
+            <w:r>
+              <w:rPr>
+                <w:sz w:val="20"/>
+                <w:szCs w:val="20"/>
+                <w:lang w:val="pt-BR"/>
+              </w:rPr>
+              <w:t xml:space="preserve">144,9 a 180,1</w:t>
+            </w:r>
+          </w:p>
+        </w:tc>
+        <w:tc>
+          <w:tcPr>
+            <w:tcW w:w="1300" w:type="dxa"/>
+            <w:vAlign w:val="center"/>
+          </w:tcPr>
+          <w:p>
+            <w:pPr>
+              <w:keepNext/>
+              <w:spacing w:before="20" w:after="20" w:line="240" w:lineRule="auto"/>
+              <w:jc w:val="center"/>
+              <w:rPr>
+                <w:lang w:val="pt-BR"/>
+              </w:rPr>
+            </w:pPr>
+            <w:r>
+              <w:rPr>
+                <w:sz w:val="20"/>
+                <w:szCs w:val="20"/>
+                <w:lang w:val="pt-BR"/>
+              </w:rPr>
+              <w:t xml:space="preserve">35,39</w:t>
+            </w:r>
+          </w:p>
+        </w:tc>
+        <w:tc>
+          <w:tcPr>
+            <w:tcW w:w="1460" w:type="dxa"/>
+            <w:vAlign w:val="center"/>
+          </w:tcPr>
+          <w:p>
+            <w:pPr>
+              <w:keepNext/>
+              <w:spacing w:before="20" w:after="20" w:line="240" w:lineRule="auto"/>
+              <w:jc w:val="center"/>
+              <w:rPr>
+                <w:lang w:val="pt-BR"/>
+              </w:rPr>
+            </w:pPr>
+            <w:r>
+              <w:rPr>
+                <w:sz w:val="20"/>
+                <w:szCs w:val="20"/>
+                <w:lang w:val="pt-BR"/>
+              </w:rPr>
+              <w:t xml:space="preserve">12.946</w:t>
+            </w:r>
+          </w:p>
+        </w:tc>
+      </w:tr>
+      <w:tr>
+        <w:trPr>
+          <w:cantSplit/>
+        </w:trPr>
+        <w:tc>
+          <w:tcPr>
+            <w:tcW w:w="1100" w:type="dxa"/>
+            <w:vAlign w:val="center"/>
+          </w:tcPr>
+          <w:p>
+            <w:pPr>
+              <w:keepNext/>
+              <w:spacing w:before="20" w:after="20" w:line="240" w:lineRule="auto"/>
+              <w:jc w:val="center"/>
+              <w:rPr>
+                <w:lang w:val="pt-BR"/>
+              </w:rPr>
+            </w:pPr>
+            <w:r>
+              <w:rPr>
+                <w:sz w:val="20"/>
+                <w:szCs w:val="20"/>
+                <w:lang w:val="pt-BR"/>
+              </w:rPr>
+              <w:t xml:space="preserve">70,000</w:t>
+            </w:r>
+          </w:p>
+        </w:tc>
+        <w:tc>
+          <w:tcPr>
+            <w:tcW w:w="1050" w:type="dxa"/>
+            <w:vAlign w:val="center"/>
+          </w:tcPr>
+          <w:p>
+            <w:pPr>
+              <w:keepNext/>
+              <w:spacing w:before="20" w:after="20" w:line="240" w:lineRule="auto"/>
+              <w:jc w:val="center"/>
+              <w:rPr>
+                <w:lang w:val="pt-BR"/>
+              </w:rPr>
+            </w:pPr>
+            <w:r>
+              <w:rPr>
+                <w:sz w:val="20"/>
+                <w:szCs w:val="20"/>
+                <w:lang w:val="pt-BR"/>
+              </w:rPr>
+              <w:t xml:space="preserve">467,4</w:t>
+            </w:r>
+          </w:p>
+        </w:tc>
+        <w:tc>
+          <w:tcPr>
+            <w:tcW w:w="1400" w:type="dxa"/>
+            <w:vAlign w:val="center"/>
+          </w:tcPr>
+          <w:p>
+            <w:pPr>
+              <w:keepNext/>
+              <w:spacing w:before="20" w:after="20" w:line="240" w:lineRule="auto"/>
+              <w:jc w:val="center"/>
+              <w:rPr>
+                <w:lang w:val="pt-BR"/>
+              </w:rPr>
+            </w:pPr>
+            <w:r>
+              <w:rPr>
+                <w:sz w:val="20"/>
+                <w:szCs w:val="20"/>
+                <w:lang w:val="pt-BR"/>
+              </w:rPr>
+              <w:t xml:space="preserve">249,4</w:t>
+            </w:r>
+          </w:p>
+        </w:tc>
+        <w:tc>
+          <w:tcPr>
+            <w:tcW w:w="1150" w:type="dxa"/>
+            <w:vAlign w:val="center"/>
+          </w:tcPr>
+          <w:p>
+            <w:pPr>
+              <w:keepNext/>
+              <w:spacing w:before="20" w:after="20" w:line="240" w:lineRule="auto"/>
+              <w:jc w:val="center"/>
+              <w:rPr>
+                <w:lang w:val="pt-BR"/>
+              </w:rPr>
+            </w:pPr>
+            <w:r>
+              <w:rPr>
+                <w:sz w:val="20"/>
+                <w:szCs w:val="20"/>
+                <w:lang w:val="pt-BR"/>
+              </w:rPr>
+              <w:t xml:space="preserve">−44,49</w:t>
+            </w:r>
+          </w:p>
+        </w:tc>
+        <w:tc>
+          <w:tcPr>
+            <w:tcW w:w="1900" w:type="dxa"/>
+            <w:vAlign w:val="center"/>
+          </w:tcPr>
+          <w:p>
+            <w:pPr>
+              <w:keepNext/>
+              <w:spacing w:before="20" w:after="20" w:line="240" w:lineRule="auto"/>
+              <w:jc w:val="center"/>
+              <w:rPr>
+                <w:lang w:val="pt-BR"/>
+              </w:rPr>
+            </w:pPr>
+            <w:r>
+              <w:rPr>
+                <w:sz w:val="20"/>
+                <w:szCs w:val="20"/>
+                <w:lang w:val="pt-BR"/>
+              </w:rPr>
+              <w:t xml:space="preserve">140,1 a 180,1</w:t>
+            </w:r>
+          </w:p>
+        </w:tc>
+        <w:tc>
+          <w:tcPr>
+            <w:tcW w:w="1300" w:type="dxa"/>
+            <w:vAlign w:val="center"/>
+          </w:tcPr>
+          <w:p>
+            <w:pPr>
+              <w:keepNext/>
+              <w:spacing w:before="20" w:after="20" w:line="240" w:lineRule="auto"/>
+              <w:jc w:val="center"/>
+              <w:rPr>
+                <w:lang w:val="pt-BR"/>
+              </w:rPr>
+            </w:pPr>
+            <w:r>
+              <w:rPr>
+                <w:sz w:val="20"/>
+                <w:szCs w:val="20"/>
+                <w:lang w:val="pt-BR"/>
+              </w:rPr>
+              <w:t xml:space="preserve">35,82</w:t>
+            </w:r>
+          </w:p>
+        </w:tc>
+        <w:tc>
+          <w:tcPr>
+            <w:tcW w:w="1460" w:type="dxa"/>
+            <w:vAlign w:val="center"/>
+          </w:tcPr>
+          <w:p>
+            <w:pPr>
+              <w:keepNext/>
+              <w:spacing w:before="20" w:after="20" w:line="240" w:lineRule="auto"/>
+              <w:jc w:val="center"/>
+              <w:rPr>
+                <w:lang w:val="pt-BR"/>
+              </w:rPr>
+            </w:pPr>
+            <w:r>
+              <w:rPr>
+                <w:sz w:val="20"/>
+                <w:szCs w:val="20"/>
+                <w:lang w:val="pt-BR"/>
+              </w:rPr>
+              <w:t xml:space="preserve">13.768</w:t>
+            </w:r>
+          </w:p>
+        </w:tc>
+      </w:tr>
+      <w:tr>
+        <w:trPr>
+          <w:cantSplit/>
+        </w:trPr>
+        <w:tc>
+          <w:tcPr>
+            <w:tcW w:w="1100" w:type="dxa"/>
+            <w:vAlign w:val="center"/>
+          </w:tcPr>
+          <w:p>
+            <w:pPr>
+              <w:keepNext/>
+              <w:spacing w:before="20" w:after="20" w:line="240" w:lineRule="auto"/>
+              <w:jc w:val="center"/>
+              <w:rPr>
+                <w:lang w:val="pt-BR"/>
+              </w:rPr>
+            </w:pPr>
+            <w:r>
+              <w:rPr>
+                <w:sz w:val="20"/>
+                <w:szCs w:val="20"/>
+                <w:lang w:val="pt-BR"/>
+              </w:rPr>
+              <w:t xml:space="preserve">76,846</w:t>
+            </w:r>
+          </w:p>
+        </w:tc>
+        <w:tc>
+          <w:tcPr>
+            <w:tcW w:w="1050" w:type="dxa"/>
+            <w:vAlign w:val="center"/>
+          </w:tcPr>
+          <w:p>
+            <w:pPr>
+              <w:keepNext/>
+              <w:spacing w:before="20" w:after="20" w:line="240" w:lineRule="auto"/>
+              <w:jc w:val="center"/>
+              <w:rPr>
+                <w:lang w:val="pt-BR"/>
+              </w:rPr>
+            </w:pPr>
+            <w:r>
+              <w:rPr>
+                <w:sz w:val="20"/>
+                <w:szCs w:val="20"/>
+                <w:lang w:val="pt-BR"/>
+              </w:rPr>
+              <w:t xml:space="preserve">516,7</w:t>
+            </w:r>
+          </w:p>
+        </w:tc>
+        <w:tc>
+          <w:tcPr>
+            <w:tcW w:w="1400" w:type="dxa"/>
+            <w:vAlign w:val="center"/>
+          </w:tcPr>
+          <w:p>
+            <w:pPr>
+              <w:keepNext/>
+              <w:spacing w:before="20" w:after="20" w:line="240" w:lineRule="auto"/>
+              <w:jc w:val="center"/>
+              <w:rPr>
+                <w:lang w:val="pt-BR"/>
+              </w:rPr>
+            </w:pPr>
+            <w:r>
+              <w:rPr>
+                <w:sz w:val="20"/>
+                <w:szCs w:val="20"/>
+                <w:lang w:val="pt-BR"/>
+              </w:rPr>
+              <w:t xml:space="preserve">262,3</w:t>
+            </w:r>
+          </w:p>
+        </w:tc>
+        <w:tc>
+          <w:tcPr>
+            <w:tcW w:w="1150" w:type="dxa"/>
+            <w:vAlign w:val="center"/>
+          </w:tcPr>
+          <w:p>
+            <w:pPr>
+              <w:keepNext/>
+              <w:spacing w:before="20" w:after="20" w:line="240" w:lineRule="auto"/>
+              <w:jc w:val="center"/>
+              <w:rPr>
+                <w:lang w:val="pt-BR"/>
+              </w:rPr>
+            </w:pPr>
+            <w:r>
+              <w:rPr>
+                <w:sz w:val="20"/>
+                <w:szCs w:val="20"/>
+                <w:lang w:val="pt-BR"/>
+              </w:rPr>
+              <w:t xml:space="preserve">−52,72</w:t>
+            </w:r>
+          </w:p>
+        </w:tc>
+        <w:tc>
+          <w:tcPr>
+            <w:tcW w:w="1900" w:type="dxa"/>
+            <w:vAlign w:val="center"/>
+          </w:tcPr>
+          <w:p>
+            <w:pPr>
+              <w:keepNext/>
+              <w:spacing w:before="20" w:after="20" w:line="240" w:lineRule="auto"/>
+              <w:jc w:val="center"/>
+              <w:rPr>
+                <w:lang w:val="pt-BR"/>
+              </w:rPr>
+            </w:pPr>
+            <w:r>
+              <w:rPr>
+                <w:sz w:val="20"/>
+                <w:szCs w:val="20"/>
+                <w:lang w:val="pt-BR"/>
+              </w:rPr>
+              <w:t xml:space="preserve">137,6 a 180,1</w:t>
+            </w:r>
+          </w:p>
+        </w:tc>
+        <w:tc>
+          <w:tcPr>
+            <w:tcW w:w="1300" w:type="dxa"/>
+            <w:vAlign w:val="center"/>
+          </w:tcPr>
+          <w:p>
+            <w:pPr>
+              <w:keepNext/>
+              <w:spacing w:before="20" w:after="20" w:line="240" w:lineRule="auto"/>
+              <w:jc w:val="center"/>
+              <w:rPr>
+                <w:lang w:val="pt-BR"/>
+              </w:rPr>
+            </w:pPr>
+            <w:r>
+              <w:rPr>
+                <w:sz w:val="20"/>
+                <w:szCs w:val="20"/>
+                <w:lang w:val="pt-BR"/>
+              </w:rPr>
+              <w:t xml:space="preserve">36,05</w:t>
+            </w:r>
+          </w:p>
+        </w:tc>
+        <w:tc>
+          <w:tcPr>
+            <w:tcW w:w="1460" w:type="dxa"/>
+            <w:vAlign w:val="center"/>
+          </w:tcPr>
+          <w:p>
+            <w:pPr>
+              <w:keepNext/>
+              <w:spacing w:before="20" w:after="20" w:line="240" w:lineRule="auto"/>
+              <w:jc w:val="center"/>
+              <w:rPr>
+                <w:lang w:val="pt-BR"/>
+              </w:rPr>
+            </w:pPr>
+            <w:r>
+              <w:rPr>
+                <w:sz w:val="20"/>
+                <w:szCs w:val="20"/>
+                <w:lang w:val="pt-BR"/>
+              </w:rPr>
+              <w:t xml:space="preserve">14.308</w:t>
             </w:r>
           </w:p>
         </w:tc>
@@ -24756,7 +25784,7 @@
           <w:szCs w:val="20"/>
           <w:lang w:val="pt-BR"/>
         </w:rPr>
-        <w:t xml:space="preserve">Nota: 22,701 mm é o h adotado; 32,886 mm, a fronteira de tração. K δ</w:t>
+        <w:t xml:space="preserve">Nota: 22,701 mm é o h identificado; 32,886 mm, a fronteira de tração; 76,846 mm, o limite geométrico do CAD. K δ</w:t>
       </w:r>
       <w:r>
         <w:rPr>
@@ -24786,7 +25814,46 @@
         <w:rPr>
           <w:lang w:val="pt-BR"/>
         </w:rPr>
-        <w:t xml:space="preserve">O ótimo estrito, h* = 32,886 mm, devolve 32% mais torque médio na faixa de trabalho que o h adotado, 44% mais torque de pico e 28% mais trabalho. Ele tem, porém, extensão mínima nula: com o braço elevado a 180,1°, a mola chega ao comprimento livre e o cabo fica no limite do afrouxamento, sem pré-tensão. Qualquer tolerância de montagem, folga do cabo ou relaxação da mola faria o cabo afrouxar nessa postura. Por isso, o ótimo de projeto é o h que maximiza o torque mantendo uma margem mínima de extensão, δ</w:t>
+        <w:t xml:space="preserve">O pico, a média de 90° a 150° e o trabalho devolvido crescem monotonicamente com h em todo o intervalo, até o limite do CAD. O motivo é geométrico: o braço de momento é limitado por |OA| = √(h</w:t>
+      </w:r>
+      <w:r>
+        <w:rPr>
+          <w:vertAlign w:val="superscript"/>
+          <w:lang w:val="pt-BR"/>
+        </w:rPr>
+        <w:t xml:space="preserve">2</w:t>
+      </w:r>
+      <w:r>
+        <w:rPr>
+          <w:lang w:val="pt-BR"/>
+        </w:rPr>
+        <w:t xml:space="preserve"> + p</w:t>
+      </w:r>
+      <w:r>
+        <w:rPr>
+          <w:vertAlign w:val="superscript"/>
+          <w:lang w:val="pt-BR"/>
+        </w:rPr>
+        <w:t xml:space="preserve">2</w:t>
+      </w:r>
+      <w:r>
+        <w:rPr>
+          <w:lang w:val="pt-BR"/>
+        </w:rPr>
+        <w:t xml:space="preserve">), que cresce com h, e o curso do cabo, e com ele a força da mola, cresce junto. Não há ótimo interior; o que separa as configurações é a tração. Até a fronteira, o maior torque devolvido com o cabo tracionado em toda a faixa ocorre em h* = 32,886 mm, com média de 163,6 u.p., 32% acima do h identificado. Além dela, o torque total continua a crescer, mas o cabo fica frouxo em parte da faixa: a partir de 173,8° de elevação em h = 35 mm, de 151,9° em h = 50 mm e de 137,6° no limite do CAD, onde o pico chega a 3,5 vezes o do h identificado.</w:t>
+      </w:r>
+    </w:p>
+    <w:p>
+      <w:pPr>
+        <w:rPr>
+          <w:lang w:val="pt-BR"/>
+        </w:rPr>
+      </w:pPr>
+      <w:r>
+        <w:rPr>
+          <w:lang w:val="pt-BR"/>
+        </w:rPr>
+        <w:t xml:space="preserve">No ótimo estrito, a extensão mínima é nula: com o braço elevado a 180,1°, a mola chega ao comprimento livre e o cabo fica no limite do afrouxamento, sem pré-tensão. Qualquer tolerância de montagem ou relaxação da mola levaria o cabo à folga nessa postura. Por isso, o ótimo de projeto é o h que maximiza o torque mantendo uma margem mínima de extensão, δ</w:t>
       </w:r>
       <w:r>
         <w:rPr>
@@ -24799,7 +25866,7 @@
         <w:rPr>
           <w:lang w:val="pt-BR"/>
         </w:rPr>
-        <w:t xml:space="preserve"> na Equação (28).</w:t>
+        <w:t xml:space="preserve"> na Equação (28), conforme a Tabela 11.</w:t>
       </w:r>
     </w:p>
     <w:p>
@@ -24984,7 +26051,7 @@
                 <w:szCs w:val="20"/>
                 <w:lang w:val="pt-BR"/>
               </w:rPr>
-              <w:t xml:space="preserve">Ganho sobre o h adotado</w:t>
+              <w:t xml:space="preserve">Ganho sobre o h identificado</w:t>
             </w:r>
           </w:p>
         </w:tc>
@@ -25638,7 +26705,7 @@
         <w:rPr>
           <w:lang w:val="pt-BR"/>
         </w:rPr>
-        <w:t xml:space="preserve">Como a extensão mínima decresce linearmente com h, cada milímetro de margem custa cerca de 0,85 mm de ancoragem. Com margem de 5 mm, o ótimo fica em h* = 28,67 mm e devolve 20% mais torque médio que o h adotado; com margem de 10 mm, em h* = 24,44 mm, o ganho cai a 6%. O h adotado corresponde a uma margem de 12,04 mm. A escolha da margem é decisão de projeto, que depende da tolerância de montagem e da especificação da mola, e não pode ser fixada pela análise.</w:t>
+        <w:t xml:space="preserve">Como a extensão mínima decresce linearmente com h, cada milímetro de margem custa cerca de 0,85 mm de ancoragem. Com margem de 5 mm, o ótimo fica em h* = 28,67 mm, com 20% mais torque médio que o h identificado; com margem de 10 mm, em h* = 24,44 mm, com 6%. O h identificado corresponde a uma margem de 12,04 mm. A escolha da margem é decisão de projeto, que depende da tolerância de montagem e da especificação da mola.</w:t>
       </w:r>
     </w:p>
     <w:p>
@@ -25651,7 +26718,7 @@
         <w:rPr>
           <w:lang w:val="pt-BR"/>
         </w:rPr>
-        <w:t xml:space="preserve">O ganho de torque tem duas contrapartidas. A primeira é a carga na mola: a tração máxima, K δ</w:t>
+        <w:t xml:space="preserve">O ganho de torque tem duas contrapartidas mecânicas. A tração máxima no cabo, K δ</w:t>
       </w:r>
       <w:r>
         <w:rPr>
@@ -25664,7 +26731,7 @@
         <w:rPr>
           <w:lang w:val="pt-BR"/>
         </w:rPr>
-        <w:t xml:space="preserve">, cresce 10,5% do h adotado à fronteira de tração. A segunda é o ponto morto, que se desloca de 30,49° para 32,92° de elevação: o braço passa a ser liberado 2,4° mais cedo ao ser abaixado, afastando-se do início da zona neutra indicado na patente. O pico também se desloca, de 97,5° para 94,9° de elevação, aproximando-se do pico gravitacional, a 89,44°.</w:t>
+        <w:t xml:space="preserve">, cresce 10,5% do h identificado à fronteira de tração e 50% até o limite do CAD. O ponto morto se desloca de 30,49° para 32,92° de elevação na fronteira e para 36,05° no limite do CAD, de modo que o torque se anula mais cedo ao se abaixar o braço.</w:t>
       </w:r>
     </w:p>
     <w:p>
@@ -25677,1699 +26744,7 @@
         <w:rPr>
           <w:lang w:val="pt-BR"/>
         </w:rPr>
-        <w:t xml:space="preserve">Acima da fronteira de tração, e até o limite geométrico de 76,846 mm, o mecanismo continua a funcionar com a mesma mola e a mesma montagem, mas o cabo afrouxa no início da faixa. Com o braço muito elevado, o caminho do cabo encurta mais do que a pré-extensão da pose comporta, a mola volta ao comprimento livre e, pela Equação (19), a força e o torque se anulam nesse trecho. A Tabela 12 mostra o efeito.</w:t>
-      </w:r>
-    </w:p>
-    <w:p>
-      <w:pPr>
-        <w:keepNext/>
-        <w:spacing w:before="120" w:after="60"/>
-        <w:rPr>
-          <w:lang w:val="pt-BR"/>
-        </w:rPr>
-      </w:pPr>
-      <w:r>
-        <w:rPr>
-          <w:b/>
-          <w:lang w:val="pt-BR"/>
-        </w:rPr>
-        <w:t xml:space="preserve">Tabela 12 — Torque devolvido com folga de cabo, para h acima da fronteira de tração (K e X</w:t>
-      </w:r>
-      <w:r>
-        <w:rPr>
-          <w:b/>
-          <w:vertAlign w:val="subscript"/>
-          <w:lang w:val="pt-BR"/>
-        </w:rPr>
-        <w:t xml:space="preserve">pose</w:t>
-      </w:r>
-      <w:r>
-        <w:rPr>
-          <w:b/>
-          <w:lang w:val="pt-BR"/>
-        </w:rPr>
-        <w:t xml:space="preserve"> congelados)</w:t>
-      </w:r>
-    </w:p>
-    <w:tbl>
-      <w:tblPr>
-        <w:tblStyle w:val="Tabelacomgrade"/>
-        <w:tblW w:w="9360" w:type="dxa"/>
-        <w:jc w:val="center"/>
-        <w:tblLayout w:type="fixed"/>
-        <w:tblLook w:val="0420" w:firstRow="1" w:lastRow="0" w:firstColumn="0" w:lastColumn="0" w:noHBand="0" w:noVBand="1"/>
-      </w:tblPr>
-      <w:tblGrid>
-        <w:gridCol w:w="1150"/>
-        <w:gridCol w:w="1700"/>
-        <w:gridCol w:w="1400"/>
-        <w:gridCol w:w="1300"/>
-        <w:gridCol w:w="1500"/>
-        <w:gridCol w:w="1310"/>
-        <w:gridCol w:w="1000"/>
-      </w:tblGrid>
-      <w:tr>
-        <w:trPr>
-          <w:cantSplit/>
-          <w:tblHeader/>
-        </w:trPr>
-        <w:tc>
-          <w:tcPr>
-            <w:tcW w:w="1150" w:type="dxa"/>
-            <w:shd w:val="clear" w:color="auto" w:fill="F2F2F2"/>
-            <w:vAlign w:val="center"/>
-          </w:tcPr>
-          <w:p>
-            <w:pPr>
-              <w:keepNext/>
-              <w:spacing w:before="20" w:after="20" w:line="240" w:lineRule="auto"/>
-              <w:jc w:val="center"/>
-              <w:rPr>
-                <w:lang w:val="pt-BR"/>
-              </w:rPr>
-            </w:pPr>
-            <w:r>
-              <w:rPr>
-                <w:b/>
-                <w:sz w:val="20"/>
-                <w:szCs w:val="20"/>
-                <w:lang w:val="pt-BR"/>
-              </w:rPr>
-              <w:t xml:space="preserve">h (mm)</w:t>
-            </w:r>
-          </w:p>
-        </w:tc>
-        <w:tc>
-          <w:tcPr>
-            <w:tcW w:w="1700" w:type="dxa"/>
-            <w:shd w:val="clear" w:color="auto" w:fill="F2F2F2"/>
-            <w:vAlign w:val="center"/>
-          </w:tcPr>
-          <w:p>
-            <w:pPr>
-              <w:keepNext/>
-              <w:spacing w:before="20" w:after="20" w:line="240" w:lineRule="auto"/>
-              <w:jc w:val="center"/>
-              <w:rPr>
-                <w:lang w:val="pt-BR"/>
-              </w:rPr>
-            </w:pPr>
-            <w:r>
-              <w:rPr>
-                <w:b/>
-                <w:sz w:val="20"/>
-                <w:szCs w:val="20"/>
-                <w:lang w:val="pt-BR"/>
-              </w:rPr>
-              <w:t xml:space="preserve">Sem assistência, elevação (°)</w:t>
-            </w:r>
-          </w:p>
-        </w:tc>
-        <w:tc>
-          <w:tcPr>
-            <w:tcW w:w="1400" w:type="dxa"/>
-            <w:shd w:val="clear" w:color="auto" w:fill="F2F2F2"/>
-            <w:vAlign w:val="center"/>
-          </w:tcPr>
-          <w:p>
-            <w:pPr>
-              <w:keepNext/>
-              <w:spacing w:before="20" w:after="20" w:line="240" w:lineRule="auto"/>
-              <w:jc w:val="center"/>
-              <w:rPr>
-                <w:lang w:val="pt-BR"/>
-              </w:rPr>
-            </w:pPr>
-            <w:r>
-              <w:rPr>
-                <w:b/>
-                <w:sz w:val="20"/>
-                <w:szCs w:val="20"/>
-                <w:lang w:val="pt-BR"/>
-              </w:rPr>
-              <w:t xml:space="preserve">Peso no início da folga (N·m)</w:t>
-            </w:r>
-          </w:p>
-        </w:tc>
-        <w:tc>
-          <w:tcPr>
-            <w:tcW w:w="1300" w:type="dxa"/>
-            <w:shd w:val="clear" w:color="auto" w:fill="F2F2F2"/>
-            <w:vAlign w:val="center"/>
-          </w:tcPr>
-          <w:p>
-            <w:pPr>
-              <w:keepNext/>
-              <w:spacing w:before="20" w:after="20" w:line="240" w:lineRule="auto"/>
-              <w:jc w:val="center"/>
-              <w:rPr>
-                <w:lang w:val="pt-BR"/>
-              </w:rPr>
-            </w:pPr>
-            <w:r>
-              <w:rPr>
-                <w:b/>
-                <w:sz w:val="20"/>
-                <w:szCs w:val="20"/>
-                <w:lang w:val="pt-BR"/>
-              </w:rPr>
-              <w:t xml:space="preserve">Pico (u.p.)</w:t>
-            </w:r>
-          </w:p>
-        </w:tc>
-        <w:tc>
-          <w:tcPr>
-            <w:tcW w:w="1500" w:type="dxa"/>
-            <w:shd w:val="clear" w:color="auto" w:fill="F2F2F2"/>
-            <w:vAlign w:val="center"/>
-          </w:tcPr>
-          <w:p>
-            <w:pPr>
-              <w:keepNext/>
-              <w:spacing w:before="20" w:after="20" w:line="240" w:lineRule="auto"/>
-              <w:jc w:val="center"/>
-              <w:rPr>
-                <w:lang w:val="pt-BR"/>
-              </w:rPr>
-            </w:pPr>
-            <w:r>
-              <w:rPr>
-                <w:b/>
-                <w:sz w:val="20"/>
-                <w:szCs w:val="20"/>
-                <w:lang w:val="pt-BR"/>
-              </w:rPr>
-              <w:t xml:space="preserve">Média 90°–150° (u.p.)</w:t>
-            </w:r>
-          </w:p>
-        </w:tc>
-        <w:tc>
-          <w:tcPr>
-            <w:tcW w:w="1310" w:type="dxa"/>
-            <w:shd w:val="clear" w:color="auto" w:fill="F2F2F2"/>
-            <w:vAlign w:val="center"/>
-          </w:tcPr>
-          <w:p>
-            <w:pPr>
-              <w:keepNext/>
-              <w:spacing w:before="20" w:after="20" w:line="240" w:lineRule="auto"/>
-              <w:jc w:val="center"/>
-              <w:rPr>
-                <w:lang w:val="pt-BR"/>
-              </w:rPr>
-            </w:pPr>
-            <w:r>
-              <w:rPr>
-                <w:b/>
-                <w:sz w:val="20"/>
-                <w:szCs w:val="20"/>
-                <w:lang w:val="pt-BR"/>
-              </w:rPr>
-              <w:t xml:space="preserve">Torque a 150° (u.p.)</w:t>
-            </w:r>
-          </w:p>
-        </w:tc>
-        <w:tc>
-          <w:tcPr>
-            <w:tcW w:w="1000" w:type="dxa"/>
-            <w:shd w:val="clear" w:color="auto" w:fill="F2F2F2"/>
-            <w:vAlign w:val="center"/>
-          </w:tcPr>
-          <w:p>
-            <w:pPr>
-              <w:keepNext/>
-              <w:spacing w:before="20" w:after="20" w:line="240" w:lineRule="auto"/>
-              <w:jc w:val="center"/>
-              <w:rPr>
-                <w:lang w:val="pt-BR"/>
-              </w:rPr>
-            </w:pPr>
-            <w:r>
-              <w:rPr>
-                <w:b/>
-                <w:sz w:val="20"/>
-                <w:szCs w:val="20"/>
-                <w:lang w:val="pt-BR"/>
-              </w:rPr>
-              <w:t xml:space="preserve">Ponto morto (°)</w:t>
-            </w:r>
-          </w:p>
-        </w:tc>
-      </w:tr>
-      <w:tr>
-        <w:trPr>
-          <w:cantSplit/>
-        </w:trPr>
-        <w:tc>
-          <w:tcPr>
-            <w:tcW w:w="1150" w:type="dxa"/>
-            <w:vAlign w:val="center"/>
-          </w:tcPr>
-          <w:p>
-            <w:pPr>
-              <w:keepNext/>
-              <w:spacing w:before="20" w:after="20" w:line="240" w:lineRule="auto"/>
-              <w:jc w:val="center"/>
-              <w:rPr>
-                <w:lang w:val="pt-BR"/>
-              </w:rPr>
-            </w:pPr>
-            <w:r>
-              <w:rPr>
-                <w:sz w:val="20"/>
-                <w:szCs w:val="20"/>
-                <w:lang w:val="pt-BR"/>
-              </w:rPr>
-              <w:t xml:space="preserve">32,886</w:t>
-            </w:r>
-          </w:p>
-        </w:tc>
-        <w:tc>
-          <w:tcPr>
-            <w:tcW w:w="1700" w:type="dxa"/>
-            <w:vAlign w:val="center"/>
-          </w:tcPr>
-          <w:p>
-            <w:pPr>
-              <w:keepNext/>
-              <w:spacing w:before="20" w:after="20" w:line="240" w:lineRule="auto"/>
-              <w:jc w:val="center"/>
-              <w:rPr>
-                <w:lang w:val="pt-BR"/>
-              </w:rPr>
-            </w:pPr>
-            <w:r>
-              <w:rPr>
-                <w:sz w:val="20"/>
-                <w:szCs w:val="20"/>
-                <w:lang w:val="pt-BR"/>
-              </w:rPr>
-              <w:t xml:space="preserve">nenhuma</w:t>
-            </w:r>
-          </w:p>
-        </w:tc>
-        <w:tc>
-          <w:tcPr>
-            <w:tcW w:w="1400" w:type="dxa"/>
-            <w:vAlign w:val="center"/>
-          </w:tcPr>
-          <w:p>
-            <w:pPr>
-              <w:keepNext/>
-              <w:spacing w:before="20" w:after="20" w:line="240" w:lineRule="auto"/>
-              <w:jc w:val="center"/>
-              <w:rPr>
-                <w:lang w:val="pt-BR"/>
-              </w:rPr>
-            </w:pPr>
-            <w:r>
-              <w:rPr>
-                <w:sz w:val="20"/>
-                <w:szCs w:val="20"/>
-                <w:lang w:val="pt-BR"/>
-              </w:rPr>
-              <w:t xml:space="preserve">—</w:t>
-            </w:r>
-          </w:p>
-        </w:tc>
-        <w:tc>
-          <w:tcPr>
-            <w:tcW w:w="1300" w:type="dxa"/>
-            <w:vAlign w:val="center"/>
-          </w:tcPr>
-          <w:p>
-            <w:pPr>
-              <w:keepNext/>
-              <w:spacing w:before="20" w:after="20" w:line="240" w:lineRule="auto"/>
-              <w:jc w:val="center"/>
-              <w:rPr>
-                <w:lang w:val="pt-BR"/>
-              </w:rPr>
-            </w:pPr>
-            <w:r>
-              <w:rPr>
-                <w:sz w:val="20"/>
-                <w:szCs w:val="20"/>
-                <w:lang w:val="pt-BR"/>
-              </w:rPr>
-              <w:t xml:space="preserve">211,9</w:t>
-            </w:r>
-          </w:p>
-        </w:tc>
-        <w:tc>
-          <w:tcPr>
-            <w:tcW w:w="1500" w:type="dxa"/>
-            <w:vAlign w:val="center"/>
-          </w:tcPr>
-          <w:p>
-            <w:pPr>
-              <w:keepNext/>
-              <w:spacing w:before="20" w:after="20" w:line="240" w:lineRule="auto"/>
-              <w:jc w:val="center"/>
-              <w:rPr>
-                <w:lang w:val="pt-BR"/>
-              </w:rPr>
-            </w:pPr>
-            <w:r>
-              <w:rPr>
-                <w:sz w:val="20"/>
-                <w:szCs w:val="20"/>
-                <w:lang w:val="pt-BR"/>
-              </w:rPr>
-              <w:t xml:space="preserve">163,6</w:t>
-            </w:r>
-          </w:p>
-        </w:tc>
-        <w:tc>
-          <w:tcPr>
-            <w:tcW w:w="1310" w:type="dxa"/>
-            <w:vAlign w:val="center"/>
-          </w:tcPr>
-          <w:p>
-            <w:pPr>
-              <w:keepNext/>
-              <w:spacing w:before="20" w:after="20" w:line="240" w:lineRule="auto"/>
-              <w:jc w:val="center"/>
-              <w:rPr>
-                <w:lang w:val="pt-BR"/>
-              </w:rPr>
-            </w:pPr>
-            <w:r>
-              <w:rPr>
-                <w:sz w:val="20"/>
-                <w:szCs w:val="20"/>
-                <w:lang w:val="pt-BR"/>
-              </w:rPr>
-              <w:t xml:space="preserve">73,9</w:t>
-            </w:r>
-          </w:p>
-        </w:tc>
-        <w:tc>
-          <w:tcPr>
-            <w:tcW w:w="1000" w:type="dxa"/>
-            <w:vAlign w:val="center"/>
-          </w:tcPr>
-          <w:p>
-            <w:pPr>
-              <w:keepNext/>
-              <w:spacing w:before="20" w:after="20" w:line="240" w:lineRule="auto"/>
-              <w:jc w:val="center"/>
-              <w:rPr>
-                <w:lang w:val="pt-BR"/>
-              </w:rPr>
-            </w:pPr>
-            <w:r>
-              <w:rPr>
-                <w:sz w:val="20"/>
-                <w:szCs w:val="20"/>
-                <w:lang w:val="pt-BR"/>
-              </w:rPr>
-              <w:t xml:space="preserve">32,92</w:t>
-            </w:r>
-          </w:p>
-        </w:tc>
-      </w:tr>
-      <w:tr>
-        <w:trPr>
-          <w:cantSplit/>
-        </w:trPr>
-        <w:tc>
-          <w:tcPr>
-            <w:tcW w:w="1150" w:type="dxa"/>
-            <w:vAlign w:val="center"/>
-          </w:tcPr>
-          <w:p>
-            <w:pPr>
-              <w:keepNext/>
-              <w:spacing w:before="20" w:after="20" w:line="240" w:lineRule="auto"/>
-              <w:jc w:val="center"/>
-              <w:rPr>
-                <w:lang w:val="pt-BR"/>
-              </w:rPr>
-            </w:pPr>
-            <w:r>
-              <w:rPr>
-                <w:sz w:val="20"/>
-                <w:szCs w:val="20"/>
-                <w:lang w:val="pt-BR"/>
-              </w:rPr>
-              <w:t xml:space="preserve">35,000</w:t>
-            </w:r>
-          </w:p>
-        </w:tc>
-        <w:tc>
-          <w:tcPr>
-            <w:tcW w:w="1700" w:type="dxa"/>
-            <w:vAlign w:val="center"/>
-          </w:tcPr>
-          <w:p>
-            <w:pPr>
-              <w:keepNext/>
-              <w:spacing w:before="20" w:after="20" w:line="240" w:lineRule="auto"/>
-              <w:jc w:val="center"/>
-              <w:rPr>
-                <w:lang w:val="pt-BR"/>
-              </w:rPr>
-            </w:pPr>
-            <w:r>
-              <w:rPr>
-                <w:sz w:val="20"/>
-                <w:szCs w:val="20"/>
-                <w:lang w:val="pt-BR"/>
-              </w:rPr>
-              <w:t xml:space="preserve">173,8 a 180,1</w:t>
-            </w:r>
-          </w:p>
-        </w:tc>
-        <w:tc>
-          <w:tcPr>
-            <w:tcW w:w="1400" w:type="dxa"/>
-            <w:vAlign w:val="center"/>
-          </w:tcPr>
-          <w:p>
-            <w:pPr>
-              <w:keepNext/>
-              <w:spacing w:before="20" w:after="20" w:line="240" w:lineRule="auto"/>
-              <w:jc w:val="center"/>
-              <w:rPr>
-                <w:lang w:val="pt-BR"/>
-              </w:rPr>
-            </w:pPr>
-            <w:r>
-              <w:rPr>
-                <w:sz w:val="20"/>
-                <w:szCs w:val="20"/>
-                <w:lang w:val="pt-BR"/>
-              </w:rPr>
-              <w:t xml:space="preserve">1,09</w:t>
-            </w:r>
-          </w:p>
-        </w:tc>
-        <w:tc>
-          <w:tcPr>
-            <w:tcW w:w="1300" w:type="dxa"/>
-            <w:vAlign w:val="center"/>
-          </w:tcPr>
-          <w:p>
-            <w:pPr>
-              <w:keepNext/>
-              <w:spacing w:before="20" w:after="20" w:line="240" w:lineRule="auto"/>
-              <w:jc w:val="center"/>
-              <w:rPr>
-                <w:lang w:val="pt-BR"/>
-              </w:rPr>
-            </w:pPr>
-            <w:r>
-              <w:rPr>
-                <w:sz w:val="20"/>
-                <w:szCs w:val="20"/>
-                <w:lang w:val="pt-BR"/>
-              </w:rPr>
-              <w:t xml:space="preserve">225,7</w:t>
-            </w:r>
-          </w:p>
-        </w:tc>
-        <w:tc>
-          <w:tcPr>
-            <w:tcW w:w="1500" w:type="dxa"/>
-            <w:vAlign w:val="center"/>
-          </w:tcPr>
-          <w:p>
-            <w:pPr>
-              <w:keepNext/>
-              <w:spacing w:before="20" w:after="20" w:line="240" w:lineRule="auto"/>
-              <w:jc w:val="center"/>
-              <w:rPr>
-                <w:lang w:val="pt-BR"/>
-              </w:rPr>
-            </w:pPr>
-            <w:r>
-              <w:rPr>
-                <w:sz w:val="20"/>
-                <w:szCs w:val="20"/>
-                <w:lang w:val="pt-BR"/>
-              </w:rPr>
-              <w:t xml:space="preserve">170,8</w:t>
-            </w:r>
-          </w:p>
-        </w:tc>
-        <w:tc>
-          <w:tcPr>
-            <w:tcW w:w="1310" w:type="dxa"/>
-            <w:vAlign w:val="center"/>
-          </w:tcPr>
-          <w:p>
-            <w:pPr>
-              <w:keepNext/>
-              <w:spacing w:before="20" w:after="20" w:line="240" w:lineRule="auto"/>
-              <w:jc w:val="center"/>
-              <w:rPr>
-                <w:lang w:val="pt-BR"/>
-              </w:rPr>
-            </w:pPr>
-            <w:r>
-              <w:rPr>
-                <w:sz w:val="20"/>
-                <w:szCs w:val="20"/>
-                <w:lang w:val="pt-BR"/>
-              </w:rPr>
-              <w:t xml:space="preserve">70,3</w:t>
-            </w:r>
-          </w:p>
-        </w:tc>
-        <w:tc>
-          <w:tcPr>
-            <w:tcW w:w="1000" w:type="dxa"/>
-            <w:vAlign w:val="center"/>
-          </w:tcPr>
-          <w:p>
-            <w:pPr>
-              <w:keepNext/>
-              <w:spacing w:before="20" w:after="20" w:line="240" w:lineRule="auto"/>
-              <w:jc w:val="center"/>
-              <w:rPr>
-                <w:lang w:val="pt-BR"/>
-              </w:rPr>
-            </w:pPr>
-            <w:r>
-              <w:rPr>
-                <w:sz w:val="20"/>
-                <w:szCs w:val="20"/>
-                <w:lang w:val="pt-BR"/>
-              </w:rPr>
-              <w:t xml:space="preserve">33,25</w:t>
-            </w:r>
-          </w:p>
-        </w:tc>
-      </w:tr>
-      <w:tr>
-        <w:trPr>
-          <w:cantSplit/>
-        </w:trPr>
-        <w:tc>
-          <w:tcPr>
-            <w:tcW w:w="1150" w:type="dxa"/>
-            <w:vAlign w:val="center"/>
-          </w:tcPr>
-          <w:p>
-            <w:pPr>
-              <w:keepNext/>
-              <w:spacing w:before="20" w:after="20" w:line="240" w:lineRule="auto"/>
-              <w:jc w:val="center"/>
-              <w:rPr>
-                <w:lang w:val="pt-BR"/>
-              </w:rPr>
-            </w:pPr>
-            <w:r>
-              <w:rPr>
-                <w:sz w:val="20"/>
-                <w:szCs w:val="20"/>
-                <w:lang w:val="pt-BR"/>
-              </w:rPr>
-              <w:t xml:space="preserve">40,000</w:t>
-            </w:r>
-          </w:p>
-        </w:tc>
-        <w:tc>
-          <w:tcPr>
-            <w:tcW w:w="1700" w:type="dxa"/>
-            <w:vAlign w:val="center"/>
-          </w:tcPr>
-          <w:p>
-            <w:pPr>
-              <w:keepNext/>
-              <w:spacing w:before="20" w:after="20" w:line="240" w:lineRule="auto"/>
-              <w:jc w:val="center"/>
-              <w:rPr>
-                <w:lang w:val="pt-BR"/>
-              </w:rPr>
-            </w:pPr>
-            <w:r>
-              <w:rPr>
-                <w:sz w:val="20"/>
-                <w:szCs w:val="20"/>
-                <w:lang w:val="pt-BR"/>
-              </w:rPr>
-              <w:t xml:space="preserve">163,8 a 180,1</w:t>
-            </w:r>
-          </w:p>
-        </w:tc>
-        <w:tc>
-          <w:tcPr>
-            <w:tcW w:w="1400" w:type="dxa"/>
-            <w:vAlign w:val="center"/>
-          </w:tcPr>
-          <w:p>
-            <w:pPr>
-              <w:keepNext/>
-              <w:spacing w:before="20" w:after="20" w:line="240" w:lineRule="auto"/>
-              <w:jc w:val="center"/>
-              <w:rPr>
-                <w:lang w:val="pt-BR"/>
-              </w:rPr>
-            </w:pPr>
-            <w:r>
-              <w:rPr>
-                <w:sz w:val="20"/>
-                <w:szCs w:val="20"/>
-                <w:lang w:val="pt-BR"/>
-              </w:rPr>
-              <w:t xml:space="preserve">3,02</w:t>
-            </w:r>
-          </w:p>
-        </w:tc>
-        <w:tc>
-          <w:tcPr>
-            <w:tcW w:w="1300" w:type="dxa"/>
-            <w:vAlign w:val="center"/>
-          </w:tcPr>
-          <w:p>
-            <w:pPr>
-              <w:keepNext/>
-              <w:spacing w:before="20" w:after="20" w:line="240" w:lineRule="auto"/>
-              <w:jc w:val="center"/>
-              <w:rPr>
-                <w:lang w:val="pt-BR"/>
-              </w:rPr>
-            </w:pPr>
-            <w:r>
-              <w:rPr>
-                <w:sz w:val="20"/>
-                <w:szCs w:val="20"/>
-                <w:lang w:val="pt-BR"/>
-              </w:rPr>
-              <w:t xml:space="preserve">258,7</w:t>
-            </w:r>
-          </w:p>
-        </w:tc>
-        <w:tc>
-          <w:tcPr>
-            <w:tcW w:w="1500" w:type="dxa"/>
-            <w:vAlign w:val="center"/>
-          </w:tcPr>
-          <w:p>
-            <w:pPr>
-              <w:keepNext/>
-              <w:spacing w:before="20" w:after="20" w:line="240" w:lineRule="auto"/>
-              <w:jc w:val="center"/>
-              <w:rPr>
-                <w:lang w:val="pt-BR"/>
-              </w:rPr>
-            </w:pPr>
-            <w:r>
-              <w:rPr>
-                <w:sz w:val="20"/>
-                <w:szCs w:val="20"/>
-                <w:lang w:val="pt-BR"/>
-              </w:rPr>
-              <w:t xml:space="preserve">186,4</w:t>
-            </w:r>
-          </w:p>
-        </w:tc>
-        <w:tc>
-          <w:tcPr>
-            <w:tcW w:w="1310" w:type="dxa"/>
-            <w:vAlign w:val="center"/>
-          </w:tcPr>
-          <w:p>
-            <w:pPr>
-              <w:keepNext/>
-              <w:spacing w:before="20" w:after="20" w:line="240" w:lineRule="auto"/>
-              <w:jc w:val="center"/>
-              <w:rPr>
-                <w:lang w:val="pt-BR"/>
-              </w:rPr>
-            </w:pPr>
-            <w:r>
-              <w:rPr>
-                <w:sz w:val="20"/>
-                <w:szCs w:val="20"/>
-                <w:lang w:val="pt-BR"/>
-              </w:rPr>
-              <w:t xml:space="preserve">57,5</w:t>
-            </w:r>
-          </w:p>
-        </w:tc>
-        <w:tc>
-          <w:tcPr>
-            <w:tcW w:w="1000" w:type="dxa"/>
-            <w:vAlign w:val="center"/>
-          </w:tcPr>
-          <w:p>
-            <w:pPr>
-              <w:keepNext/>
-              <w:spacing w:before="20" w:after="20" w:line="240" w:lineRule="auto"/>
-              <w:jc w:val="center"/>
-              <w:rPr>
-                <w:lang w:val="pt-BR"/>
-              </w:rPr>
-            </w:pPr>
-            <w:r>
-              <w:rPr>
-                <w:sz w:val="20"/>
-                <w:szCs w:val="20"/>
-                <w:lang w:val="pt-BR"/>
-              </w:rPr>
-              <w:t xml:space="preserve">33,89</w:t>
-            </w:r>
-          </w:p>
-        </w:tc>
-      </w:tr>
-      <w:tr>
-        <w:trPr>
-          <w:cantSplit/>
-        </w:trPr>
-        <w:tc>
-          <w:tcPr>
-            <w:tcW w:w="1150" w:type="dxa"/>
-            <w:vAlign w:val="center"/>
-          </w:tcPr>
-          <w:p>
-            <w:pPr>
-              <w:keepNext/>
-              <w:spacing w:before="20" w:after="20" w:line="240" w:lineRule="auto"/>
-              <w:jc w:val="center"/>
-              <w:rPr>
-                <w:lang w:val="pt-BR"/>
-              </w:rPr>
-            </w:pPr>
-            <w:r>
-              <w:rPr>
-                <w:sz w:val="20"/>
-                <w:szCs w:val="20"/>
-                <w:lang w:val="pt-BR"/>
-              </w:rPr>
-              <w:t xml:space="preserve">45,000</w:t>
-            </w:r>
-          </w:p>
-        </w:tc>
-        <w:tc>
-          <w:tcPr>
-            <w:tcW w:w="1700" w:type="dxa"/>
-            <w:vAlign w:val="center"/>
-          </w:tcPr>
-          <w:p>
-            <w:pPr>
-              <w:keepNext/>
-              <w:spacing w:before="20" w:after="20" w:line="240" w:lineRule="auto"/>
-              <w:jc w:val="center"/>
-              <w:rPr>
-                <w:lang w:val="pt-BR"/>
-              </w:rPr>
-            </w:pPr>
-            <w:r>
-              <w:rPr>
-                <w:sz w:val="20"/>
-                <w:szCs w:val="20"/>
-                <w:lang w:val="pt-BR"/>
-              </w:rPr>
-              <w:t xml:space="preserve">157,0 a 180,1</w:t>
-            </w:r>
-          </w:p>
-        </w:tc>
-        <w:tc>
-          <w:tcPr>
-            <w:tcW w:w="1400" w:type="dxa"/>
-            <w:vAlign w:val="center"/>
-          </w:tcPr>
-          <w:p>
-            <w:pPr>
-              <w:keepNext/>
-              <w:spacing w:before="20" w:after="20" w:line="240" w:lineRule="auto"/>
-              <w:jc w:val="center"/>
-              <w:rPr>
-                <w:lang w:val="pt-BR"/>
-              </w:rPr>
-            </w:pPr>
-            <w:r>
-              <w:rPr>
-                <w:sz w:val="20"/>
-                <w:szCs w:val="20"/>
-                <w:lang w:val="pt-BR"/>
-              </w:rPr>
-              <w:t xml:space="preserve">4,27</w:t>
-            </w:r>
-          </w:p>
-        </w:tc>
-        <w:tc>
-          <w:tcPr>
-            <w:tcW w:w="1300" w:type="dxa"/>
-            <w:vAlign w:val="center"/>
-          </w:tcPr>
-          <w:p>
-            <w:pPr>
-              <w:keepNext/>
-              <w:spacing w:before="20" w:after="20" w:line="240" w:lineRule="auto"/>
-              <w:jc w:val="center"/>
-              <w:rPr>
-                <w:lang w:val="pt-BR"/>
-              </w:rPr>
-            </w:pPr>
-            <w:r>
-              <w:rPr>
-                <w:sz w:val="20"/>
-                <w:szCs w:val="20"/>
-                <w:lang w:val="pt-BR"/>
-              </w:rPr>
-              <w:t xml:space="preserve">292,3</w:t>
-            </w:r>
-          </w:p>
-        </w:tc>
-        <w:tc>
-          <w:tcPr>
-            <w:tcW w:w="1500" w:type="dxa"/>
-            <w:vAlign w:val="center"/>
-          </w:tcPr>
-          <w:p>
-            <w:pPr>
-              <w:keepNext/>
-              <w:spacing w:before="20" w:after="20" w:line="240" w:lineRule="auto"/>
-              <w:jc w:val="center"/>
-              <w:rPr>
-                <w:lang w:val="pt-BR"/>
-              </w:rPr>
-            </w:pPr>
-            <w:r>
-              <w:rPr>
-                <w:sz w:val="20"/>
-                <w:szCs w:val="20"/>
-                <w:lang w:val="pt-BR"/>
-              </w:rPr>
-              <w:t xml:space="preserve">199,9</w:t>
-            </w:r>
-          </w:p>
-        </w:tc>
-        <w:tc>
-          <w:tcPr>
-            <w:tcW w:w="1310" w:type="dxa"/>
-            <w:vAlign w:val="center"/>
-          </w:tcPr>
-          <w:p>
-            <w:pPr>
-              <w:keepNext/>
-              <w:spacing w:before="20" w:after="20" w:line="240" w:lineRule="auto"/>
-              <w:jc w:val="center"/>
-              <w:rPr>
-                <w:lang w:val="pt-BR"/>
-              </w:rPr>
-            </w:pPr>
-            <w:r>
-              <w:rPr>
-                <w:sz w:val="20"/>
-                <w:szCs w:val="20"/>
-                <w:lang w:val="pt-BR"/>
-              </w:rPr>
-              <w:t xml:space="preserve">38,6</w:t>
-            </w:r>
-          </w:p>
-        </w:tc>
-        <w:tc>
-          <w:tcPr>
-            <w:tcW w:w="1000" w:type="dxa"/>
-            <w:vAlign w:val="center"/>
-          </w:tcPr>
-          <w:p>
-            <w:pPr>
-              <w:keepNext/>
-              <w:spacing w:before="20" w:after="20" w:line="240" w:lineRule="auto"/>
-              <w:jc w:val="center"/>
-              <w:rPr>
-                <w:lang w:val="pt-BR"/>
-              </w:rPr>
-            </w:pPr>
-            <w:r>
-              <w:rPr>
-                <w:sz w:val="20"/>
-                <w:szCs w:val="20"/>
-                <w:lang w:val="pt-BR"/>
-              </w:rPr>
-              <w:t xml:space="preserve">34,39</w:t>
-            </w:r>
-          </w:p>
-        </w:tc>
-      </w:tr>
-      <w:tr>
-        <w:trPr>
-          <w:cantSplit/>
-        </w:trPr>
-        <w:tc>
-          <w:tcPr>
-            <w:tcW w:w="1150" w:type="dxa"/>
-            <w:vAlign w:val="center"/>
-          </w:tcPr>
-          <w:p>
-            <w:pPr>
-              <w:keepNext/>
-              <w:spacing w:before="20" w:after="20" w:line="240" w:lineRule="auto"/>
-              <w:jc w:val="center"/>
-              <w:rPr>
-                <w:lang w:val="pt-BR"/>
-              </w:rPr>
-            </w:pPr>
-            <w:r>
-              <w:rPr>
-                <w:sz w:val="20"/>
-                <w:szCs w:val="20"/>
-                <w:lang w:val="pt-BR"/>
-              </w:rPr>
-              <w:t xml:space="preserve">50,000</w:t>
-            </w:r>
-          </w:p>
-        </w:tc>
-        <w:tc>
-          <w:tcPr>
-            <w:tcW w:w="1700" w:type="dxa"/>
-            <w:vAlign w:val="center"/>
-          </w:tcPr>
-          <w:p>
-            <w:pPr>
-              <w:keepNext/>
-              <w:spacing w:before="20" w:after="20" w:line="240" w:lineRule="auto"/>
-              <w:jc w:val="center"/>
-              <w:rPr>
-                <w:lang w:val="pt-BR"/>
-              </w:rPr>
-            </w:pPr>
-            <w:r>
-              <w:rPr>
-                <w:sz w:val="20"/>
-                <w:szCs w:val="20"/>
-                <w:lang w:val="pt-BR"/>
-              </w:rPr>
-              <w:t xml:space="preserve">151,9 a 180,1</w:t>
-            </w:r>
-          </w:p>
-        </w:tc>
-        <w:tc>
-          <w:tcPr>
-            <w:tcW w:w="1400" w:type="dxa"/>
-            <w:vAlign w:val="center"/>
-          </w:tcPr>
-          <w:p>
-            <w:pPr>
-              <w:keepNext/>
-              <w:spacing w:before="20" w:after="20" w:line="240" w:lineRule="auto"/>
-              <w:jc w:val="center"/>
-              <w:rPr>
-                <w:lang w:val="pt-BR"/>
-              </w:rPr>
-            </w:pPr>
-            <w:r>
-              <w:rPr>
-                <w:sz w:val="20"/>
-                <w:szCs w:val="20"/>
-                <w:lang w:val="pt-BR"/>
-              </w:rPr>
-              <w:t xml:space="preserve">5,15</w:t>
-            </w:r>
-          </w:p>
-        </w:tc>
-        <w:tc>
-          <w:tcPr>
-            <w:tcW w:w="1300" w:type="dxa"/>
-            <w:vAlign w:val="center"/>
-          </w:tcPr>
-          <w:p>
-            <w:pPr>
-              <w:keepNext/>
-              <w:spacing w:before="20" w:after="20" w:line="240" w:lineRule="auto"/>
-              <w:jc w:val="center"/>
-              <w:rPr>
-                <w:lang w:val="pt-BR"/>
-              </w:rPr>
-            </w:pPr>
-            <w:r>
-              <w:rPr>
-                <w:sz w:val="20"/>
-                <w:szCs w:val="20"/>
-                <w:lang w:val="pt-BR"/>
-              </w:rPr>
-              <w:t xml:space="preserve">326,5</w:t>
-            </w:r>
-          </w:p>
-        </w:tc>
-        <w:tc>
-          <w:tcPr>
-            <w:tcW w:w="1500" w:type="dxa"/>
-            <w:vAlign w:val="center"/>
-          </w:tcPr>
-          <w:p>
-            <w:pPr>
-              <w:keepNext/>
-              <w:spacing w:before="20" w:after="20" w:line="240" w:lineRule="auto"/>
-              <w:jc w:val="center"/>
-              <w:rPr>
-                <w:lang w:val="pt-BR"/>
-              </w:rPr>
-            </w:pPr>
-            <w:r>
-              <w:rPr>
-                <w:sz w:val="20"/>
-                <w:szCs w:val="20"/>
-                <w:lang w:val="pt-BR"/>
-              </w:rPr>
-              <w:t xml:space="preserve">211,3</w:t>
-            </w:r>
-          </w:p>
-        </w:tc>
-        <w:tc>
-          <w:tcPr>
-            <w:tcW w:w="1310" w:type="dxa"/>
-            <w:vAlign w:val="center"/>
-          </w:tcPr>
-          <w:p>
-            <w:pPr>
-              <w:keepNext/>
-              <w:spacing w:before="20" w:after="20" w:line="240" w:lineRule="auto"/>
-              <w:jc w:val="center"/>
-              <w:rPr>
-                <w:lang w:val="pt-BR"/>
-              </w:rPr>
-            </w:pPr>
-            <w:r>
-              <w:rPr>
-                <w:sz w:val="20"/>
-                <w:szCs w:val="20"/>
-                <w:lang w:val="pt-BR"/>
-              </w:rPr>
-              <w:t xml:space="preserve">13,7</w:t>
-            </w:r>
-          </w:p>
-        </w:tc>
-        <w:tc>
-          <w:tcPr>
-            <w:tcW w:w="1000" w:type="dxa"/>
-            <w:vAlign w:val="center"/>
-          </w:tcPr>
-          <w:p>
-            <w:pPr>
-              <w:keepNext/>
-              <w:spacing w:before="20" w:after="20" w:line="240" w:lineRule="auto"/>
-              <w:jc w:val="center"/>
-              <w:rPr>
-                <w:lang w:val="pt-BR"/>
-              </w:rPr>
-            </w:pPr>
-            <w:r>
-              <w:rPr>
-                <w:sz w:val="20"/>
-                <w:szCs w:val="20"/>
-                <w:lang w:val="pt-BR"/>
-              </w:rPr>
-              <w:t xml:space="preserve">34,79</w:t>
-            </w:r>
-          </w:p>
-        </w:tc>
-      </w:tr>
-      <w:tr>
-        <w:trPr>
-          <w:cantSplit/>
-        </w:trPr>
-        <w:tc>
-          <w:tcPr>
-            <w:tcW w:w="1150" w:type="dxa"/>
-            <w:vAlign w:val="center"/>
-          </w:tcPr>
-          <w:p>
-            <w:pPr>
-              <w:keepNext/>
-              <w:spacing w:before="20" w:after="20" w:line="240" w:lineRule="auto"/>
-              <w:jc w:val="center"/>
-              <w:rPr>
-                <w:lang w:val="pt-BR"/>
-              </w:rPr>
-            </w:pPr>
-            <w:r>
-              <w:rPr>
-                <w:sz w:val="20"/>
-                <w:szCs w:val="20"/>
-                <w:lang w:val="pt-BR"/>
-              </w:rPr>
-              <w:t xml:space="preserve">60,000</w:t>
-            </w:r>
-          </w:p>
-        </w:tc>
-        <w:tc>
-          <w:tcPr>
-            <w:tcW w:w="1700" w:type="dxa"/>
-            <w:vAlign w:val="center"/>
-          </w:tcPr>
-          <w:p>
-            <w:pPr>
-              <w:keepNext/>
-              <w:spacing w:before="20" w:after="20" w:line="240" w:lineRule="auto"/>
-              <w:jc w:val="center"/>
-              <w:rPr>
-                <w:lang w:val="pt-BR"/>
-              </w:rPr>
-            </w:pPr>
-            <w:r>
-              <w:rPr>
-                <w:sz w:val="20"/>
-                <w:szCs w:val="20"/>
-                <w:lang w:val="pt-BR"/>
-              </w:rPr>
-              <w:t xml:space="preserve">144,9 a 180,1</w:t>
-            </w:r>
-          </w:p>
-        </w:tc>
-        <w:tc>
-          <w:tcPr>
-            <w:tcW w:w="1400" w:type="dxa"/>
-            <w:vAlign w:val="center"/>
-          </w:tcPr>
-          <w:p>
-            <w:pPr>
-              <w:keepNext/>
-              <w:spacing w:before="20" w:after="20" w:line="240" w:lineRule="auto"/>
-              <w:jc w:val="center"/>
-              <w:rPr>
-                <w:lang w:val="pt-BR"/>
-              </w:rPr>
-            </w:pPr>
-            <w:r>
-              <w:rPr>
-                <w:sz w:val="20"/>
-                <w:szCs w:val="20"/>
-                <w:lang w:val="pt-BR"/>
-              </w:rPr>
-              <w:t xml:space="preserve">6,33</w:t>
-            </w:r>
-          </w:p>
-        </w:tc>
-        <w:tc>
-          <w:tcPr>
-            <w:tcW w:w="1300" w:type="dxa"/>
-            <w:vAlign w:val="center"/>
-          </w:tcPr>
-          <w:p>
-            <w:pPr>
-              <w:keepNext/>
-              <w:spacing w:before="20" w:after="20" w:line="240" w:lineRule="auto"/>
-              <w:jc w:val="center"/>
-              <w:rPr>
-                <w:lang w:val="pt-BR"/>
-              </w:rPr>
-            </w:pPr>
-            <w:r>
-              <w:rPr>
-                <w:sz w:val="20"/>
-                <w:szCs w:val="20"/>
-                <w:lang w:val="pt-BR"/>
-              </w:rPr>
-              <w:t xml:space="preserve">396,2</w:t>
-            </w:r>
-          </w:p>
-        </w:tc>
-        <w:tc>
-          <w:tcPr>
-            <w:tcW w:w="1500" w:type="dxa"/>
-            <w:vAlign w:val="center"/>
-          </w:tcPr>
-          <w:p>
-            <w:pPr>
-              <w:keepNext/>
-              <w:spacing w:before="20" w:after="20" w:line="240" w:lineRule="auto"/>
-              <w:jc w:val="center"/>
-              <w:rPr>
-                <w:lang w:val="pt-BR"/>
-              </w:rPr>
-            </w:pPr>
-            <w:r>
-              <w:rPr>
-                <w:sz w:val="20"/>
-                <w:szCs w:val="20"/>
-                <w:lang w:val="pt-BR"/>
-              </w:rPr>
-              <w:t xml:space="preserve">230,5</w:t>
-            </w:r>
-          </w:p>
-        </w:tc>
-        <w:tc>
-          <w:tcPr>
-            <w:tcW w:w="1310" w:type="dxa"/>
-            <w:vAlign w:val="center"/>
-          </w:tcPr>
-          <w:p>
-            <w:pPr>
-              <w:keepNext/>
-              <w:spacing w:before="20" w:after="20" w:line="240" w:lineRule="auto"/>
-              <w:jc w:val="center"/>
-              <w:rPr>
-                <w:lang w:val="pt-BR"/>
-              </w:rPr>
-            </w:pPr>
-            <w:r>
-              <w:rPr>
-                <w:sz w:val="20"/>
-                <w:szCs w:val="20"/>
-                <w:lang w:val="pt-BR"/>
-              </w:rPr>
-              <w:t xml:space="preserve">0,0</w:t>
-            </w:r>
-          </w:p>
-        </w:tc>
-        <w:tc>
-          <w:tcPr>
-            <w:tcW w:w="1000" w:type="dxa"/>
-            <w:vAlign w:val="center"/>
-          </w:tcPr>
-          <w:p>
-            <w:pPr>
-              <w:keepNext/>
-              <w:spacing w:before="20" w:after="20" w:line="240" w:lineRule="auto"/>
-              <w:jc w:val="center"/>
-              <w:rPr>
-                <w:lang w:val="pt-BR"/>
-              </w:rPr>
-            </w:pPr>
-            <w:r>
-              <w:rPr>
-                <w:sz w:val="20"/>
-                <w:szCs w:val="20"/>
-                <w:lang w:val="pt-BR"/>
-              </w:rPr>
-              <w:t xml:space="preserve">35,39</w:t>
-            </w:r>
-          </w:p>
-        </w:tc>
-      </w:tr>
-      <w:tr>
-        <w:trPr>
-          <w:cantSplit/>
-        </w:trPr>
-        <w:tc>
-          <w:tcPr>
-            <w:tcW w:w="1150" w:type="dxa"/>
-            <w:vAlign w:val="center"/>
-          </w:tcPr>
-          <w:p>
-            <w:pPr>
-              <w:keepNext/>
-              <w:spacing w:before="20" w:after="20" w:line="240" w:lineRule="auto"/>
-              <w:jc w:val="center"/>
-              <w:rPr>
-                <w:lang w:val="pt-BR"/>
-              </w:rPr>
-            </w:pPr>
-            <w:r>
-              <w:rPr>
-                <w:sz w:val="20"/>
-                <w:szCs w:val="20"/>
-                <w:lang w:val="pt-BR"/>
-              </w:rPr>
-              <w:t xml:space="preserve">70,000</w:t>
-            </w:r>
-          </w:p>
-        </w:tc>
-        <w:tc>
-          <w:tcPr>
-            <w:tcW w:w="1700" w:type="dxa"/>
-            <w:vAlign w:val="center"/>
-          </w:tcPr>
-          <w:p>
-            <w:pPr>
-              <w:keepNext/>
-              <w:spacing w:before="20" w:after="20" w:line="240" w:lineRule="auto"/>
-              <w:jc w:val="center"/>
-              <w:rPr>
-                <w:lang w:val="pt-BR"/>
-              </w:rPr>
-            </w:pPr>
-            <w:r>
-              <w:rPr>
-                <w:sz w:val="20"/>
-                <w:szCs w:val="20"/>
-                <w:lang w:val="pt-BR"/>
-              </w:rPr>
-              <w:t xml:space="preserve">140,1 a 180,1</w:t>
-            </w:r>
-          </w:p>
-        </w:tc>
-        <w:tc>
-          <w:tcPr>
-            <w:tcW w:w="1400" w:type="dxa"/>
-            <w:vAlign w:val="center"/>
-          </w:tcPr>
-          <w:p>
-            <w:pPr>
-              <w:keepNext/>
-              <w:spacing w:before="20" w:after="20" w:line="240" w:lineRule="auto"/>
-              <w:jc w:val="center"/>
-              <w:rPr>
-                <w:lang w:val="pt-BR"/>
-              </w:rPr>
-            </w:pPr>
-            <w:r>
-              <w:rPr>
-                <w:sz w:val="20"/>
-                <w:szCs w:val="20"/>
-                <w:lang w:val="pt-BR"/>
-              </w:rPr>
-              <w:t xml:space="preserve">7,08</w:t>
-            </w:r>
-          </w:p>
-        </w:tc>
-        <w:tc>
-          <w:tcPr>
-            <w:tcW w:w="1300" w:type="dxa"/>
-            <w:vAlign w:val="center"/>
-          </w:tcPr>
-          <w:p>
-            <w:pPr>
-              <w:keepNext/>
-              <w:spacing w:before="20" w:after="20" w:line="240" w:lineRule="auto"/>
-              <w:jc w:val="center"/>
-              <w:rPr>
-                <w:lang w:val="pt-BR"/>
-              </w:rPr>
-            </w:pPr>
-            <w:r>
-              <w:rPr>
-                <w:sz w:val="20"/>
-                <w:szCs w:val="20"/>
-                <w:lang w:val="pt-BR"/>
-              </w:rPr>
-              <w:t xml:space="preserve">467,4</w:t>
-            </w:r>
-          </w:p>
-        </w:tc>
-        <w:tc>
-          <w:tcPr>
-            <w:tcW w:w="1500" w:type="dxa"/>
-            <w:vAlign w:val="center"/>
-          </w:tcPr>
-          <w:p>
-            <w:pPr>
-              <w:keepNext/>
-              <w:spacing w:before="20" w:after="20" w:line="240" w:lineRule="auto"/>
-              <w:jc w:val="center"/>
-              <w:rPr>
-                <w:lang w:val="pt-BR"/>
-              </w:rPr>
-            </w:pPr>
-            <w:r>
-              <w:rPr>
-                <w:sz w:val="20"/>
-                <w:szCs w:val="20"/>
-                <w:lang w:val="pt-BR"/>
-              </w:rPr>
-              <w:t xml:space="preserve">249,4</w:t>
-            </w:r>
-          </w:p>
-        </w:tc>
-        <w:tc>
-          <w:tcPr>
-            <w:tcW w:w="1310" w:type="dxa"/>
-            <w:vAlign w:val="center"/>
-          </w:tcPr>
-          <w:p>
-            <w:pPr>
-              <w:keepNext/>
-              <w:spacing w:before="20" w:after="20" w:line="240" w:lineRule="auto"/>
-              <w:jc w:val="center"/>
-              <w:rPr>
-                <w:lang w:val="pt-BR"/>
-              </w:rPr>
-            </w:pPr>
-            <w:r>
-              <w:rPr>
-                <w:sz w:val="20"/>
-                <w:szCs w:val="20"/>
-                <w:lang w:val="pt-BR"/>
-              </w:rPr>
-              <w:t xml:space="preserve">0,0</w:t>
-            </w:r>
-          </w:p>
-        </w:tc>
-        <w:tc>
-          <w:tcPr>
-            <w:tcW w:w="1000" w:type="dxa"/>
-            <w:vAlign w:val="center"/>
-          </w:tcPr>
-          <w:p>
-            <w:pPr>
-              <w:keepNext/>
-              <w:spacing w:before="20" w:after="20" w:line="240" w:lineRule="auto"/>
-              <w:jc w:val="center"/>
-              <w:rPr>
-                <w:lang w:val="pt-BR"/>
-              </w:rPr>
-            </w:pPr>
-            <w:r>
-              <w:rPr>
-                <w:sz w:val="20"/>
-                <w:szCs w:val="20"/>
-                <w:lang w:val="pt-BR"/>
-              </w:rPr>
-              <w:t xml:space="preserve">35,82</w:t>
-            </w:r>
-          </w:p>
-        </w:tc>
-      </w:tr>
-      <w:tr>
-        <w:trPr>
-          <w:cantSplit/>
-        </w:trPr>
-        <w:tc>
-          <w:tcPr>
-            <w:tcW w:w="1150" w:type="dxa"/>
-            <w:vAlign w:val="center"/>
-          </w:tcPr>
-          <w:p>
-            <w:pPr>
-              <w:keepNext/>
-              <w:spacing w:before="20" w:after="20" w:line="240" w:lineRule="auto"/>
-              <w:jc w:val="center"/>
-              <w:rPr>
-                <w:lang w:val="pt-BR"/>
-              </w:rPr>
-            </w:pPr>
-            <w:r>
-              <w:rPr>
-                <w:sz w:val="20"/>
-                <w:szCs w:val="20"/>
-                <w:lang w:val="pt-BR"/>
-              </w:rPr>
-              <w:t xml:space="preserve">76,846</w:t>
-            </w:r>
-          </w:p>
-        </w:tc>
-        <w:tc>
-          <w:tcPr>
-            <w:tcW w:w="1700" w:type="dxa"/>
-            <w:vAlign w:val="center"/>
-          </w:tcPr>
-          <w:p>
-            <w:pPr>
-              <w:keepNext/>
-              <w:spacing w:before="20" w:after="20" w:line="240" w:lineRule="auto"/>
-              <w:jc w:val="center"/>
-              <w:rPr>
-                <w:lang w:val="pt-BR"/>
-              </w:rPr>
-            </w:pPr>
-            <w:r>
-              <w:rPr>
-                <w:sz w:val="20"/>
-                <w:szCs w:val="20"/>
-                <w:lang w:val="pt-BR"/>
-              </w:rPr>
-              <w:t xml:space="preserve">137,6 a 180,1</w:t>
-            </w:r>
-          </w:p>
-        </w:tc>
-        <w:tc>
-          <w:tcPr>
-            <w:tcW w:w="1400" w:type="dxa"/>
-            <w:vAlign w:val="center"/>
-          </w:tcPr>
-          <w:p>
-            <w:pPr>
-              <w:keepNext/>
-              <w:spacing w:before="20" w:after="20" w:line="240" w:lineRule="auto"/>
-              <w:jc w:val="center"/>
-              <w:rPr>
-                <w:lang w:val="pt-BR"/>
-              </w:rPr>
-            </w:pPr>
-            <w:r>
-              <w:rPr>
-                <w:sz w:val="20"/>
-                <w:szCs w:val="20"/>
-                <w:lang w:val="pt-BR"/>
-              </w:rPr>
-              <w:t xml:space="preserve">7,45</w:t>
-            </w:r>
-          </w:p>
-        </w:tc>
-        <w:tc>
-          <w:tcPr>
-            <w:tcW w:w="1300" w:type="dxa"/>
-            <w:vAlign w:val="center"/>
-          </w:tcPr>
-          <w:p>
-            <w:pPr>
-              <w:keepNext/>
-              <w:spacing w:before="20" w:after="20" w:line="240" w:lineRule="auto"/>
-              <w:jc w:val="center"/>
-              <w:rPr>
-                <w:lang w:val="pt-BR"/>
-              </w:rPr>
-            </w:pPr>
-            <w:r>
-              <w:rPr>
-                <w:sz w:val="20"/>
-                <w:szCs w:val="20"/>
-                <w:lang w:val="pt-BR"/>
-              </w:rPr>
-              <w:t xml:space="preserve">516,7</w:t>
-            </w:r>
-          </w:p>
-        </w:tc>
-        <w:tc>
-          <w:tcPr>
-            <w:tcW w:w="1500" w:type="dxa"/>
-            <w:vAlign w:val="center"/>
-          </w:tcPr>
-          <w:p>
-            <w:pPr>
-              <w:keepNext/>
-              <w:spacing w:before="20" w:after="20" w:line="240" w:lineRule="auto"/>
-              <w:jc w:val="center"/>
-              <w:rPr>
-                <w:lang w:val="pt-BR"/>
-              </w:rPr>
-            </w:pPr>
-            <w:r>
-              <w:rPr>
-                <w:sz w:val="20"/>
-                <w:szCs w:val="20"/>
-                <w:lang w:val="pt-BR"/>
-              </w:rPr>
-              <w:t xml:space="preserve">262,3</w:t>
-            </w:r>
-          </w:p>
-        </w:tc>
-        <w:tc>
-          <w:tcPr>
-            <w:tcW w:w="1310" w:type="dxa"/>
-            <w:vAlign w:val="center"/>
-          </w:tcPr>
-          <w:p>
-            <w:pPr>
-              <w:keepNext/>
-              <w:spacing w:before="20" w:after="20" w:line="240" w:lineRule="auto"/>
-              <w:jc w:val="center"/>
-              <w:rPr>
-                <w:lang w:val="pt-BR"/>
-              </w:rPr>
-            </w:pPr>
-            <w:r>
-              <w:rPr>
-                <w:sz w:val="20"/>
-                <w:szCs w:val="20"/>
-                <w:lang w:val="pt-BR"/>
-              </w:rPr>
-              <w:t xml:space="preserve">0,0</w:t>
-            </w:r>
-          </w:p>
-        </w:tc>
-        <w:tc>
-          <w:tcPr>
-            <w:tcW w:w="1000" w:type="dxa"/>
-            <w:vAlign w:val="center"/>
-          </w:tcPr>
-          <w:p>
-            <w:pPr>
-              <w:keepNext/>
-              <w:spacing w:before="20" w:after="20" w:line="240" w:lineRule="auto"/>
-              <w:jc w:val="center"/>
-              <w:rPr>
-                <w:lang w:val="pt-BR"/>
-              </w:rPr>
-            </w:pPr>
-            <w:r>
-              <w:rPr>
-                <w:sz w:val="20"/>
-                <w:szCs w:val="20"/>
-                <w:lang w:val="pt-BR"/>
-              </w:rPr>
-              <w:t xml:space="preserve">36,05</w:t>
-            </w:r>
-          </w:p>
-        </w:tc>
-      </w:tr>
-    </w:tbl>
-    <w:p>
-      <w:pPr>
-        <w:spacing w:before="60" w:after="60"/>
-        <w:rPr>
-          <w:lang w:val="pt-BR"/>
-        </w:rPr>
-      </w:pPr>
-      <w:r>
-        <w:rPr>
-          <w:sz w:val="20"/>
-          <w:szCs w:val="20"/>
-          <w:lang w:val="pt-BR"/>
-        </w:rPr>
-        <w:t xml:space="preserve">Fonte: elaborada pelo autor.</w:t>
-      </w:r>
-    </w:p>
-    <w:p>
-      <w:pPr>
-        <w:spacing w:after="160"/>
-        <w:rPr>
-          <w:lang w:val="pt-BR"/>
-        </w:rPr>
-      </w:pPr>
-      <w:r>
-        <w:rPr>
-          <w:sz w:val="20"/>
-          <w:szCs w:val="20"/>
-          <w:lang w:val="pt-BR"/>
-        </w:rPr>
-        <w:t xml:space="preserve">Nota: 32,886 mm é a fronteira de tração; 76,846 mm, o limite geométrico do CAD. Torque do peso em N·m, pela Equação (24).</w:t>
-      </w:r>
-    </w:p>
-    <w:p>
-      <w:pPr>
-        <w:rPr>
-          <w:lang w:val="pt-BR"/>
-        </w:rPr>
-      </w:pPr>
-      <w:r>
-        <w:rPr>
-          <w:lang w:val="pt-BR"/>
-        </w:rPr>
-        <w:t xml:space="preserve">O torque total continua a crescer: o pico, a média de 90° a 150° e o trabalho devolvido aumentam monotonicamente até o limite do CAD, onde o pico chega a 516,7 u.p., 3,5 vezes o do h adotado. O ganho, porém, troca de lugar. A zona sem assistência começa em 173,8° de elevação para h = 35 mm, em 163,8° para h = 40 mm e em 137,6° no limite do CAD; nesse ponto, o peso do braço ainda vale 7,45 N·m, 67% do pico gravitacional. O pico do torque migra para cerca de 89°, sobre o pico gravitacional, e o ponto morto sobe a 36,0°. O mecanismo deixa de ser um apoio para trabalho acima da cabeça e passa a apoiar o braço próximo da horizontal, abandonando-o justamente nas posturas elevadas que a patente pretende atender.</w:t>
-      </w:r>
-    </w:p>
-    <w:p>
-      <w:pPr>
-        <w:rPr>
-          <w:lang w:val="pt-BR"/>
-        </w:rPr>
-      </w:pPr>
-      <w:r>
-        <w:rPr>
-          <w:lang w:val="pt-BR"/>
-        </w:rPr>
-        <w:t xml:space="preserve">Esses valores de h são alternativas de projeto, e não identificações do dispositivo da patente. Com K e X</w:t>
-      </w:r>
-      <w:r>
-        <w:rPr>
-          <w:vertAlign w:val="subscript"/>
-          <w:lang w:val="pt-BR"/>
-        </w:rPr>
-        <w:t xml:space="preserve">pose</w:t>
-      </w:r>
-      <w:r>
-        <w:rPr>
-          <w:lang w:val="pt-BR"/>
-        </w:rPr>
-        <w:t xml:space="preserve"> congelados, apenas o h adotado reproduz a curva publicada (seção 4.5); os demais descrevem o mesmo conjunto de mola e montagem com a ancoragem deslocada. O resultado indica que, para a mola identificada, a ancoragem pode ser afastada do pivô até cerca de 28 a 31 mm, conforme a margem exigida, com ganho de 20 a 28% no torque médio devolvido na faixa de trabalho, sem perda de assistência em nenhuma postura; além da fronteira de tração, o ganho de torque total é obtido à custa da assistência acima da cabeça.</w:t>
+        <w:t xml:space="preserve">Em síntese, apenas h = 22,701 mm descreve o dispositivo da patente; os demais valores indicam o que o mesmo conjunto de mola e montagem devolveria com a ancoragem deslocada. Com o cabo tracionado em toda a faixa, a ancoragem pode ser afastada do pivô até cerca de 28 a 31 mm, conforme a margem exigida, com ganho de 20 a 28% no torque médio de 90° a 150°. Além da fronteira de tração, e até o limite geométrico do CAD, o torque total continua a crescer, à custa de um trecho sem torque no início da faixa, que começa com uma quina na curva e se alarga à medida que h aumenta.</w:t>
       </w:r>
     </w:p>
     <w:p>
@@ -27829,7 +27204,7 @@
         <w:rPr>
           <w:lang w:val="pt-BR"/>
         </w:rPr>
-        <w:t xml:space="preserve">A otimização da ancoragem mostrou que, com a mesma mola, o torque devolvido cresce monotonicamente com h. O cabo permanece tracionado em toda a faixa somente para h ≤ 32,886 mm, o que exclui a cota de 34,785 mm lida no CAD. Nesse limite, o torque médio devolvido de 90° a 150° de elevação seria 32% maior que no h adotado, mas sem pré-tensão com o braço elevado; com margem de 5 mm de extensão, o ótimo de projeto fica em 28,7 mm, com ganho de 20%. Até os 76,846 mm admitidos pela geometria, o torque total continua a crescer, mas o cabo afrouxa nas posturas elevadas e a assistência desaparece acima de cerca de 138° a 174° de elevação, conforme h, o que contraria o uso previsto para o trabalho acima da cabeça. O valor adotado, 22,701 mm, mantém margem de 12 mm, e sua origem, ao contrário de K e X</w:t>
+        <w:t xml:space="preserve">A otimização da ancoragem mostrou que, com a mesma mola, o torque devolvido cresce monotonicamente com h. O cabo permanece tracionado em toda a faixa somente para h ≤ 32,886 mm, o que exclui a cota de 34,785 mm lida no CAD. Nesse limite, o torque médio devolvido de 90° a 150° de elevação seria 32% maior que no h adotado, mas sem pré-tensão com o braço elevado; com margem de 5 mm de extensão, o ótimo de projeto fica em 28,7 mm, com ganho de 20%. Até os 76,846 mm admitidos pela geometria, o torque total continua a crescer, mas o cabo afrouxa nas posturas elevadas e a assistência cessa, de forma contínua mas com uma quina na curva de torque, acima de cerca de 138° a 174° de elevação, conforme h, o que contraria o uso previsto para o trabalho acima da cabeça. O valor adotado, 22,701 mm, mantém margem de 12 mm, e sua origem, ao contrário de K e X</w:t>
       </w:r>
       <w:r>
         <w:rPr>

</xml_diff>

<commit_message>
Add the Okabe, Brittes and Brito (2026) reference to the revised TCC
Section 2.4 cited "OKABE et al., 2025" with no entry in the reference
list. The citation now reads (OKABE; BRITTES; BRITO, 2026) and the
reference (J. Comput. Nonlinear Dyn. 21(7), 071006, DOI
10.1115/1.4071946) is listed between OBUKHOV and OTTOBOCK.

Co-Authored-By: Claude Opus 5.5 <noreply@anthropic.com>
Claude-Session: https://claude.ai/code/session_01TTGvA6kwNXtYCNWyyxgT9v
</commit_message>
<xml_diff>
--- a/tcc/TCC_apenas_exo1_revisado.docx
+++ b/tcc/TCC_apenas_exo1_revisado.docx
@@ -543,7 +543,7 @@
         <w:rPr>
           <w:lang w:val="pt-BR"/>
         </w:rPr>
-        <w:t xml:space="preserve">O mapeamento da curva torque × ângulo gerada pelo mecanismo permite alinhar o perfil de suporte elástico à curva anatômica de carga do braço, otimizando a entrega de torque nas posições de maior exigência (NING et al., 2022; OKABE et al., 2025). Palazzi et al. (2022) mostram, em um exoesqueleto balanceado por gravidade, redução de 89% no torque de pico do ombro quando esse ajuste é bem resolvido.</w:t>
+        <w:t xml:space="preserve">O mapeamento da curva torque × ângulo gerada pelo mecanismo permite alinhar o perfil de suporte elástico à curva anatômica de carga do braço, otimizando a entrega de torque nas posições de maior exigência (NING et al., 2022; OKABE; BRITTES; BRITO, 2026). Palazzi et al. (2022) mostram, em um exoesqueleto balanceado por gravidade, redução de 89% no torque de pico do ombro quando esse ajuste é bem resolvido.</w:t>
       </w:r>
     </w:p>
     <w:p>
@@ -29534,6 +29534,31 @@
             <w:rStyle w:val="Hyperlink"/>
           </w:rPr>
           <w:t>10.3390/asi8040114</w:t>
+        </w:r>
+      </w:hyperlink>
+      <w:r>
+        <w:t>.</w:t>
+      </w:r>
+    </w:p>
+    <w:p>
+      <w:r>
+        <w:t xml:space="preserve">OKABE, E. P.; BRITTES, J. L. P.; BRITO, P. L. A. Modeling and simulation of an upper limb exoskeleton. </w:t>
+      </w:r>
+      <w:r>
+        <w:rPr>
+          <w:b/>
+        </w:rPr>
+        <w:t>Journal of Computational and Nonlinear Dynamics</w:t>
+      </w:r>
+      <w:r>
+        <w:t xml:space="preserve">, [S.l.], v. 21, n. 7, art. 071006, jul. 2026. DOI: </w:t>
+      </w:r>
+      <w:hyperlink r:id="rIdRefOkabe" w:history="1">
+        <w:r>
+          <w:rPr>
+            <w:rStyle w:val="Hyperlink"/>
+          </w:rPr>
+          <w:t>10.1115/1.4071946</w:t>
         </w:r>
       </w:hyperlink>
       <w:r>

</xml_diff>